<commit_message>
resolved stack depth limit exceeded
</commit_message>
<xml_diff>
--- a/Documents/Nisol-Studio/SRS-Phase-2-ChatGpt.docx
+++ b/Documents/Nisol-Studio/SRS-Phase-2-ChatGpt.docx
@@ -159,7 +159,7 @@
     <w:p>
       <w:r>
         <w:pict w14:anchorId="70584E0C">
-          <v:rect id="_x0000_i1301" style="width:0;height:1.5pt" o:hralign="center" o:hrstd="t" o:hr="t" fillcolor="#a0a0a0" stroked="f"/>
+          <v:rect id="_x0000_i1025" style="width:0;height:1.5pt" o:hralign="center" o:hrstd="t" o:hr="t" fillcolor="#a0a0a0" stroked="f"/>
         </w:pict>
       </w:r>
     </w:p>
@@ -248,7 +248,7 @@
     <w:p>
       <w:r>
         <w:pict w14:anchorId="06B708A4">
-          <v:rect id="_x0000_i1302" style="width:0;height:1.5pt" o:hralign="center" o:hrstd="t" o:hr="t" fillcolor="#a0a0a0" stroked="f"/>
+          <v:rect id="_x0000_i1026" style="width:0;height:1.5pt" o:hralign="center" o:hrstd="t" o:hr="t" fillcolor="#a0a0a0" stroked="f"/>
         </w:pict>
       </w:r>
     </w:p>
@@ -295,7 +295,7 @@
     <w:p>
       <w:r>
         <w:pict w14:anchorId="36D32CCF">
-          <v:rect id="_x0000_i1303" style="width:0;height:1.5pt" o:hralign="center" o:hrstd="t" o:hr="t" fillcolor="#a0a0a0" stroked="f"/>
+          <v:rect id="_x0000_i1027" style="width:0;height:1.5pt" o:hralign="center" o:hrstd="t" o:hr="t" fillcolor="#a0a0a0" stroked="f"/>
         </w:pict>
       </w:r>
     </w:p>
@@ -411,7 +411,7 @@
     <w:p>
       <w:r>
         <w:pict w14:anchorId="5E6AC1A3">
-          <v:rect id="_x0000_i1304" style="width:0;height:1.5pt" o:hralign="center" o:hrstd="t" o:hr="t" fillcolor="#a0a0a0" stroked="f"/>
+          <v:rect id="_x0000_i1028" style="width:0;height:1.5pt" o:hralign="center" o:hrstd="t" o:hr="t" fillcolor="#a0a0a0" stroked="f"/>
         </w:pict>
       </w:r>
     </w:p>
@@ -562,7 +562,7 @@
     <w:p>
       <w:r>
         <w:pict w14:anchorId="40936C25">
-          <v:rect id="_x0000_i1305" style="width:0;height:1.5pt" o:hralign="center" o:hrstd="t" o:hr="t" fillcolor="#a0a0a0" stroked="f"/>
+          <v:rect id="_x0000_i1029" style="width:0;height:1.5pt" o:hralign="center" o:hrstd="t" o:hr="t" fillcolor="#a0a0a0" stroked="f"/>
         </w:pict>
       </w:r>
     </w:p>
@@ -584,7 +584,7 @@
     <w:p>
       <w:r>
         <w:pict w14:anchorId="72A8B0CA">
-          <v:rect id="_x0000_i1306" style="width:0;height:1.5pt" o:hralign="center" o:hrstd="t" o:hr="t" fillcolor="#a0a0a0" stroked="f"/>
+          <v:rect id="_x0000_i1030" style="width:0;height:1.5pt" o:hralign="center" o:hrstd="t" o:hr="t" fillcolor="#a0a0a0" stroked="f"/>
         </w:pict>
       </w:r>
     </w:p>
@@ -707,7 +707,7 @@
     <w:p>
       <w:r>
         <w:pict w14:anchorId="4C931E0F">
-          <v:rect id="_x0000_i1307" style="width:0;height:1.5pt" o:hralign="center" o:hrstd="t" o:hr="t" fillcolor="#a0a0a0" stroked="f"/>
+          <v:rect id="_x0000_i1031" style="width:0;height:1.5pt" o:hralign="center" o:hrstd="t" o:hr="t" fillcolor="#a0a0a0" stroked="f"/>
         </w:pict>
       </w:r>
     </w:p>
@@ -774,7 +774,7 @@
     <w:p>
       <w:r>
         <w:pict w14:anchorId="42F4F5D9">
-          <v:rect id="_x0000_i1308" style="width:0;height:1.5pt" o:hralign="center" o:hrstd="t" o:hr="t" fillcolor="#a0a0a0" stroked="f"/>
+          <v:rect id="_x0000_i1032" style="width:0;height:1.5pt" o:hralign="center" o:hrstd="t" o:hr="t" fillcolor="#a0a0a0" stroked="f"/>
         </w:pict>
       </w:r>
     </w:p>
@@ -882,7 +882,7 @@
     <w:p>
       <w:r>
         <w:pict w14:anchorId="4A885BD9">
-          <v:rect id="_x0000_i1309" style="width:0;height:1.5pt" o:hralign="center" o:hrstd="t" o:hr="t" fillcolor="#a0a0a0" stroked="f"/>
+          <v:rect id="_x0000_i1033" style="width:0;height:1.5pt" o:hralign="center" o:hrstd="t" o:hr="t" fillcolor="#a0a0a0" stroked="f"/>
         </w:pict>
       </w:r>
     </w:p>
@@ -929,7 +929,7 @@
     <w:p>
       <w:r>
         <w:pict w14:anchorId="6C3881C0">
-          <v:rect id="_x0000_i1310" style="width:0;height:1.5pt" o:hralign="center" o:hrstd="t" o:hr="t" fillcolor="#a0a0a0" stroked="f"/>
+          <v:rect id="_x0000_i1034" style="width:0;height:1.5pt" o:hralign="center" o:hrstd="t" o:hr="t" fillcolor="#a0a0a0" stroked="f"/>
         </w:pict>
       </w:r>
     </w:p>
@@ -976,7 +976,7 @@
     <w:p>
       <w:r>
         <w:pict w14:anchorId="4ED68E7F">
-          <v:rect id="_x0000_i1311" style="width:0;height:1.5pt" o:hralign="center" o:hrstd="t" o:hr="t" fillcolor="#a0a0a0" stroked="f"/>
+          <v:rect id="_x0000_i1035" style="width:0;height:1.5pt" o:hralign="center" o:hrstd="t" o:hr="t" fillcolor="#a0a0a0" stroked="f"/>
         </w:pict>
       </w:r>
     </w:p>
@@ -1043,7 +1043,7 @@
     <w:p>
       <w:r>
         <w:pict w14:anchorId="18257FC5">
-          <v:rect id="_x0000_i1312" style="width:0;height:1.5pt" o:hralign="center" o:hrstd="t" o:hr="t" fillcolor="#a0a0a0" stroked="f"/>
+          <v:rect id="_x0000_i1036" style="width:0;height:1.5pt" o:hralign="center" o:hrstd="t" o:hr="t" fillcolor="#a0a0a0" stroked="f"/>
         </w:pict>
       </w:r>
     </w:p>
@@ -1091,7 +1091,7 @@
     <w:p>
       <w:r>
         <w:pict w14:anchorId="71A3760A">
-          <v:rect id="_x0000_i1313" style="width:0;height:1.5pt" o:hralign="center" o:hrstd="t" o:hr="t" fillcolor="#a0a0a0" stroked="f"/>
+          <v:rect id="_x0000_i1037" style="width:0;height:1.5pt" o:hralign="center" o:hrstd="t" o:hr="t" fillcolor="#a0a0a0" stroked="f"/>
         </w:pict>
       </w:r>
     </w:p>
@@ -1138,7 +1138,7 @@
     <w:p>
       <w:r>
         <w:pict w14:anchorId="26F456CB">
-          <v:rect id="_x0000_i1314" style="width:0;height:1.5pt" o:hralign="center" o:hrstd="t" o:hr="t" fillcolor="#a0a0a0" stroked="f"/>
+          <v:rect id="_x0000_i1038" style="width:0;height:1.5pt" o:hralign="center" o:hrstd="t" o:hr="t" fillcolor="#a0a0a0" stroked="f"/>
         </w:pict>
       </w:r>
     </w:p>
@@ -1185,7 +1185,7 @@
     <w:p>
       <w:r>
         <w:pict w14:anchorId="06B278A6">
-          <v:rect id="_x0000_i1315" style="width:0;height:1.5pt" o:hralign="center" o:hrstd="t" o:hr="t" fillcolor="#a0a0a0" stroked="f"/>
+          <v:rect id="_x0000_i1039" style="width:0;height:1.5pt" o:hralign="center" o:hrstd="t" o:hr="t" fillcolor="#a0a0a0" stroked="f"/>
         </w:pict>
       </w:r>
     </w:p>
@@ -1242,7 +1242,7 @@
     <w:p>
       <w:r>
         <w:pict w14:anchorId="07CB360D">
-          <v:rect id="_x0000_i1316" style="width:0;height:1.5pt" o:hralign="center" o:hrstd="t" o:hr="t" fillcolor="#a0a0a0" stroked="f"/>
+          <v:rect id="_x0000_i1040" style="width:0;height:1.5pt" o:hralign="center" o:hrstd="t" o:hr="t" fillcolor="#a0a0a0" stroked="f"/>
         </w:pict>
       </w:r>
     </w:p>
@@ -1325,7 +1325,7 @@
     <w:p>
       <w:r>
         <w:pict w14:anchorId="19E5379D">
-          <v:rect id="_x0000_i1317" style="width:0;height:1.5pt" o:hralign="center" o:hrstd="t" o:hr="t" fillcolor="#a0a0a0" stroked="f"/>
+          <v:rect id="_x0000_i1041" style="width:0;height:1.5pt" o:hralign="center" o:hrstd="t" o:hr="t" fillcolor="#a0a0a0" stroked="f"/>
         </w:pict>
       </w:r>
     </w:p>
@@ -1372,7 +1372,7 @@
     <w:p>
       <w:r>
         <w:pict w14:anchorId="09933FEE">
-          <v:rect id="_x0000_i1318" style="width:0;height:1.5pt" o:hralign="center" o:hrstd="t" o:hr="t" fillcolor="#a0a0a0" stroked="f"/>
+          <v:rect id="_x0000_i1042" style="width:0;height:1.5pt" o:hralign="center" o:hrstd="t" o:hr="t" fillcolor="#a0a0a0" stroked="f"/>
         </w:pict>
       </w:r>
     </w:p>
@@ -1424,7 +1424,7 @@
     <w:p>
       <w:r>
         <w:pict w14:anchorId="71084248">
-          <v:rect id="_x0000_i1319" style="width:0;height:1.5pt" o:hralign="center" o:hrstd="t" o:hr="t" fillcolor="#a0a0a0" stroked="f"/>
+          <v:rect id="_x0000_i1043" style="width:0;height:1.5pt" o:hralign="center" o:hrstd="t" o:hr="t" fillcolor="#a0a0a0" stroked="f"/>
         </w:pict>
       </w:r>
     </w:p>
@@ -1471,7 +1471,7 @@
     <w:p>
       <w:r>
         <w:pict w14:anchorId="64E3C688">
-          <v:rect id="_x0000_i1320" style="width:0;height:1.5pt" o:hralign="center" o:hrstd="t" o:hr="t" fillcolor="#a0a0a0" stroked="f"/>
+          <v:rect id="_x0000_i1044" style="width:0;height:1.5pt" o:hralign="center" o:hrstd="t" o:hr="t" fillcolor="#a0a0a0" stroked="f"/>
         </w:pict>
       </w:r>
     </w:p>
@@ -1539,7 +1539,7 @@
     <w:p>
       <w:r>
         <w:pict w14:anchorId="11442B59">
-          <v:rect id="_x0000_i1321" style="width:0;height:1.5pt" o:hralign="center" o:hrstd="t" o:hr="t" fillcolor="#a0a0a0" stroked="f"/>
+          <v:rect id="_x0000_i1045" style="width:0;height:1.5pt" o:hralign="center" o:hrstd="t" o:hr="t" fillcolor="#a0a0a0" stroked="f"/>
         </w:pict>
       </w:r>
     </w:p>
@@ -1581,7 +1581,7 @@
     <w:p>
       <w:r>
         <w:pict w14:anchorId="7F3FA3EF">
-          <v:rect id="_x0000_i1322" style="width:0;height:1.5pt" o:hralign="center" o:hrstd="t" o:hr="t" fillcolor="#a0a0a0" stroked="f"/>
+          <v:rect id="_x0000_i1046" style="width:0;height:1.5pt" o:hralign="center" o:hrstd="t" o:hr="t" fillcolor="#a0a0a0" stroked="f"/>
         </w:pict>
       </w:r>
     </w:p>
@@ -1628,7 +1628,7 @@
     <w:p>
       <w:r>
         <w:pict w14:anchorId="47810747">
-          <v:rect id="_x0000_i1323" style="width:0;height:1.5pt" o:hralign="center" o:hrstd="t" o:hr="t" fillcolor="#a0a0a0" stroked="f"/>
+          <v:rect id="_x0000_i1047" style="width:0;height:1.5pt" o:hralign="center" o:hrstd="t" o:hr="t" fillcolor="#a0a0a0" stroked="f"/>
         </w:pict>
       </w:r>
     </w:p>
@@ -1675,7 +1675,7 @@
     <w:p>
       <w:r>
         <w:pict w14:anchorId="3C010795">
-          <v:rect id="_x0000_i1324" style="width:0;height:1.5pt" o:hralign="center" o:hrstd="t" o:hr="t" fillcolor="#a0a0a0" stroked="f"/>
+          <v:rect id="_x0000_i1048" style="width:0;height:1.5pt" o:hralign="center" o:hrstd="t" o:hr="t" fillcolor="#a0a0a0" stroked="f"/>
         </w:pict>
       </w:r>
     </w:p>
@@ -1748,7 +1748,7 @@
     <w:p>
       <w:r>
         <w:pict w14:anchorId="0E8CC256">
-          <v:rect id="_x0000_i1325" style="width:0;height:1.5pt" o:hralign="center" o:hrstd="t" o:hr="t" fillcolor="#a0a0a0" stroked="f"/>
+          <v:rect id="_x0000_i1049" style="width:0;height:1.5pt" o:hralign="center" o:hrstd="t" o:hr="t" fillcolor="#a0a0a0" stroked="f"/>
         </w:pict>
       </w:r>
     </w:p>
@@ -1795,7 +1795,7 @@
     <w:p>
       <w:r>
         <w:pict w14:anchorId="4908239A">
-          <v:rect id="_x0000_i1326" style="width:0;height:1.5pt" o:hralign="center" o:hrstd="t" o:hr="t" fillcolor="#a0a0a0" stroked="f"/>
+          <v:rect id="_x0000_i1050" style="width:0;height:1.5pt" o:hralign="center" o:hrstd="t" o:hr="t" fillcolor="#a0a0a0" stroked="f"/>
         </w:pict>
       </w:r>
     </w:p>
@@ -1867,7 +1867,7 @@
     <w:p>
       <w:r>
         <w:pict w14:anchorId="584A93ED">
-          <v:rect id="_x0000_i1327" style="width:0;height:1.5pt" o:hralign="center" o:hrstd="t" o:hr="t" fillcolor="#a0a0a0" stroked="f"/>
+          <v:rect id="_x0000_i1051" style="width:0;height:1.5pt" o:hralign="center" o:hrstd="t" o:hr="t" fillcolor="#a0a0a0" stroked="f"/>
         </w:pict>
       </w:r>
     </w:p>
@@ -1935,7 +1935,7 @@
     <w:p>
       <w:r>
         <w:pict w14:anchorId="4019C1CA">
-          <v:rect id="_x0000_i1328" style="width:0;height:1.5pt" o:hralign="center" o:hrstd="t" o:hr="t" fillcolor="#a0a0a0" stroked="f"/>
+          <v:rect id="_x0000_i1052" style="width:0;height:1.5pt" o:hralign="center" o:hrstd="t" o:hr="t" fillcolor="#a0a0a0" stroked="f"/>
         </w:pict>
       </w:r>
     </w:p>
@@ -1982,7 +1982,7 @@
     <w:p>
       <w:r>
         <w:pict w14:anchorId="372C424B">
-          <v:rect id="_x0000_i1329" style="width:0;height:1.5pt" o:hralign="center" o:hrstd="t" o:hr="t" fillcolor="#a0a0a0" stroked="f"/>
+          <v:rect id="_x0000_i1053" style="width:0;height:1.5pt" o:hralign="center" o:hrstd="t" o:hr="t" fillcolor="#a0a0a0" stroked="f"/>
         </w:pict>
       </w:r>
     </w:p>
@@ -2049,7 +2049,7 @@
     <w:p>
       <w:r>
         <w:pict w14:anchorId="37F7FDE7">
-          <v:rect id="_x0000_i1330" style="width:0;height:1.5pt" o:hralign="center" o:hrstd="t" o:hr="t" fillcolor="#a0a0a0" stroked="f"/>
+          <v:rect id="_x0000_i1054" style="width:0;height:1.5pt" o:hralign="center" o:hrstd="t" o:hr="t" fillcolor="#a0a0a0" stroked="f"/>
         </w:pict>
       </w:r>
     </w:p>
@@ -2101,7 +2101,7 @@
     <w:p>
       <w:r>
         <w:pict w14:anchorId="3FD46BC6">
-          <v:rect id="_x0000_i1331" style="width:0;height:1.5pt" o:hralign="center" o:hrstd="t" o:hr="t" fillcolor="#a0a0a0" stroked="f"/>
+          <v:rect id="_x0000_i1055" style="width:0;height:1.5pt" o:hralign="center" o:hrstd="t" o:hr="t" fillcolor="#a0a0a0" stroked="f"/>
         </w:pict>
       </w:r>
     </w:p>
@@ -2199,7 +2199,7 @@
     <w:p>
       <w:r>
         <w:pict w14:anchorId="53375123">
-          <v:rect id="_x0000_i1332" style="width:0;height:1.5pt" o:hralign="center" o:hrstd="t" o:hr="t" fillcolor="#a0a0a0" stroked="f"/>
+          <v:rect id="_x0000_i1056" style="width:0;height:1.5pt" o:hralign="center" o:hrstd="t" o:hr="t" fillcolor="#a0a0a0" stroked="f"/>
         </w:pict>
       </w:r>
     </w:p>
@@ -2246,7 +2246,7 @@
     <w:p>
       <w:r>
         <w:pict w14:anchorId="0C308D20">
-          <v:rect id="_x0000_i1333" style="width:0;height:1.5pt" o:hralign="center" o:hrstd="t" o:hr="t" fillcolor="#a0a0a0" stroked="f"/>
+          <v:rect id="_x0000_i1057" style="width:0;height:1.5pt" o:hralign="center" o:hrstd="t" o:hr="t" fillcolor="#a0a0a0" stroked="f"/>
         </w:pict>
       </w:r>
     </w:p>
@@ -2293,7 +2293,7 @@
     <w:p>
       <w:r>
         <w:pict w14:anchorId="3DA2BD32">
-          <v:rect id="_x0000_i1334" style="width:0;height:1.5pt" o:hralign="center" o:hrstd="t" o:hr="t" fillcolor="#a0a0a0" stroked="f"/>
+          <v:rect id="_x0000_i1058" style="width:0;height:1.5pt" o:hralign="center" o:hrstd="t" o:hr="t" fillcolor="#a0a0a0" stroked="f"/>
         </w:pict>
       </w:r>
     </w:p>
@@ -2361,7 +2361,7 @@
     <w:p>
       <w:r>
         <w:pict w14:anchorId="27410653">
-          <v:rect id="_x0000_i1335" style="width:0;height:1.5pt" o:hralign="center" o:hrstd="t" o:hr="t" fillcolor="#a0a0a0" stroked="f"/>
+          <v:rect id="_x0000_i1059" style="width:0;height:1.5pt" o:hralign="center" o:hrstd="t" o:hr="t" fillcolor="#a0a0a0" stroked="f"/>
         </w:pict>
       </w:r>
     </w:p>
@@ -2403,7 +2403,7 @@
     <w:p>
       <w:r>
         <w:pict w14:anchorId="049C6BDB">
-          <v:rect id="_x0000_i1336" style="width:0;height:1.5pt" o:hralign="center" o:hrstd="t" o:hr="t" fillcolor="#a0a0a0" stroked="f"/>
+          <v:rect id="_x0000_i1060" style="width:0;height:1.5pt" o:hralign="center" o:hrstd="t" o:hr="t" fillcolor="#a0a0a0" stroked="f"/>
         </w:pict>
       </w:r>
     </w:p>
@@ -2490,7 +2490,7 @@
     <w:p>
       <w:r>
         <w:pict w14:anchorId="7FE271E4">
-          <v:rect id="_x0000_i1337" style="width:0;height:1.5pt" o:hralign="center" o:hrstd="t" o:hr="t" fillcolor="#a0a0a0" stroked="f"/>
+          <v:rect id="_x0000_i1061" style="width:0;height:1.5pt" o:hralign="center" o:hrstd="t" o:hr="t" fillcolor="#a0a0a0" stroked="f"/>
         </w:pict>
       </w:r>
     </w:p>
@@ -2543,7 +2543,7 @@
     <w:p>
       <w:r>
         <w:pict w14:anchorId="2D384704">
-          <v:rect id="_x0000_i1338" style="width:0;height:1.5pt" o:hralign="center" o:hrstd="t" o:hr="t" fillcolor="#a0a0a0" stroked="f"/>
+          <v:rect id="_x0000_i1062" style="width:0;height:1.5pt" o:hralign="center" o:hrstd="t" o:hr="t" fillcolor="#a0a0a0" stroked="f"/>
         </w:pict>
       </w:r>
     </w:p>
@@ -2595,7 +2595,7 @@
     <w:p>
       <w:r>
         <w:pict w14:anchorId="630942C9">
-          <v:rect id="_x0000_i1339" style="width:0;height:1.5pt" o:hralign="center" o:hrstd="t" o:hr="t" fillcolor="#a0a0a0" stroked="f"/>
+          <v:rect id="_x0000_i1063" style="width:0;height:1.5pt" o:hralign="center" o:hrstd="t" o:hr="t" fillcolor="#a0a0a0" stroked="f"/>
         </w:pict>
       </w:r>
     </w:p>
@@ -2707,7 +2707,7 @@
     <w:p>
       <w:r>
         <w:pict w14:anchorId="75540D28">
-          <v:rect id="_x0000_i1340" style="width:0;height:1.5pt" o:hralign="center" o:hrstd="t" o:hr="t" fillcolor="#a0a0a0" stroked="f"/>
+          <v:rect id="_x0000_i1064" style="width:0;height:1.5pt" o:hralign="center" o:hrstd="t" o:hr="t" fillcolor="#a0a0a0" stroked="f"/>
         </w:pict>
       </w:r>
     </w:p>
@@ -2760,7 +2760,7 @@
     <w:p>
       <w:r>
         <w:pict w14:anchorId="3489A634">
-          <v:rect id="_x0000_i1341" style="width:0;height:1.5pt" o:hralign="center" o:hrstd="t" o:hr="t" fillcolor="#a0a0a0" stroked="f"/>
+          <v:rect id="_x0000_i1065" style="width:0;height:1.5pt" o:hralign="center" o:hrstd="t" o:hr="t" fillcolor="#a0a0a0" stroked="f"/>
         </w:pict>
       </w:r>
     </w:p>
@@ -2817,7 +2817,7 @@
     <w:p>
       <w:r>
         <w:pict w14:anchorId="1FB9D74F">
-          <v:rect id="_x0000_i1342" style="width:0;height:1.5pt" o:hralign="center" o:hrstd="t" o:hr="t" fillcolor="#a0a0a0" stroked="f"/>
+          <v:rect id="_x0000_i1066" style="width:0;height:1.5pt" o:hralign="center" o:hrstd="t" o:hr="t" fillcolor="#a0a0a0" stroked="f"/>
         </w:pict>
       </w:r>
     </w:p>
@@ -2869,7 +2869,7 @@
     <w:p>
       <w:r>
         <w:pict w14:anchorId="3785B0F1">
-          <v:rect id="_x0000_i1343" style="width:0;height:1.5pt" o:hralign="center" o:hrstd="t" o:hr="t" fillcolor="#a0a0a0" stroked="f"/>
+          <v:rect id="_x0000_i1067" style="width:0;height:1.5pt" o:hralign="center" o:hrstd="t" o:hr="t" fillcolor="#a0a0a0" stroked="f"/>
         </w:pict>
       </w:r>
     </w:p>
@@ -2932,7 +2932,7 @@
     <w:p>
       <w:r>
         <w:pict w14:anchorId="1EE1CCB8">
-          <v:rect id="_x0000_i1344" style="width:0;height:1.5pt" o:hralign="center" o:hrstd="t" o:hr="t" fillcolor="#a0a0a0" stroked="f"/>
+          <v:rect id="_x0000_i1068" style="width:0;height:1.5pt" o:hralign="center" o:hrstd="t" o:hr="t" fillcolor="#a0a0a0" stroked="f"/>
         </w:pict>
       </w:r>
     </w:p>
@@ -2994,7 +2994,7 @@
     <w:p>
       <w:r>
         <w:pict w14:anchorId="5777670A">
-          <v:rect id="_x0000_i1345" style="width:0;height:1.5pt" o:hralign="center" o:hrstd="t" o:hr="t" fillcolor="#a0a0a0" stroked="f"/>
+          <v:rect id="_x0000_i1069" style="width:0;height:1.5pt" o:hralign="center" o:hrstd="t" o:hr="t" fillcolor="#a0a0a0" stroked="f"/>
         </w:pict>
       </w:r>
     </w:p>
@@ -3208,7 +3208,7 @@
       <w:r>
         <w:lastRenderedPageBreak/>
         <w:pict w14:anchorId="1AB8CD51">
-          <v:rect id="_x0000_i1346" style="width:0;height:1.5pt" o:hralign="center" o:hrstd="t" o:hr="t" fillcolor="#a0a0a0" stroked="f"/>
+          <v:rect id="_x0000_i1070" style="width:0;height:1.5pt" o:hralign="center" o:hrstd="t" o:hr="t" fillcolor="#a0a0a0" stroked="f"/>
         </w:pict>
       </w:r>
     </w:p>
@@ -3614,6 +3614,2073 @@
     <w:p>
       <w:r>
         <w:t>This keeps Phase 1 focused on delivering a stable, production-ready foundation while ensuring Phase 2 adds high-value capabilities without disrupting the core Discovery workflow.</w:t>
+      </w:r>
+    </w:p>
+    <w:p>
+      <w:r>
+        <w:t xml:space="preserve">Yes, and I believe this should become one of the </w:t>
+      </w:r>
+      <w:r>
+        <w:rPr>
+          <w:b/>
+          <w:bCs/>
+        </w:rPr>
+        <w:t>strongest differentiators</w:t>
+      </w:r>
+      <w:r>
+        <w:t xml:space="preserve"> of Nisol Intelligence.</w:t>
+      </w:r>
+    </w:p>
+    <w:p>
+      <w:r>
+        <w:t xml:space="preserve">However, there is an important distinction between </w:t>
+      </w:r>
+      <w:r>
+        <w:rPr>
+          <w:b/>
+          <w:bCs/>
+        </w:rPr>
+        <w:t>benchmarks you can provide on Day 1</w:t>
+      </w:r>
+      <w:r>
+        <w:t xml:space="preserve"> and </w:t>
+      </w:r>
+      <w:r>
+        <w:rPr>
+          <w:b/>
+          <w:bCs/>
+        </w:rPr>
+        <w:t>benchmarks that become statistically valid as your platform matures</w:t>
+      </w:r>
+      <w:r>
+        <w:t>.</w:t>
+      </w:r>
+    </w:p>
+    <w:p>
+      <w:r>
+        <w:t xml:space="preserve">I recommend implementing benchmarking in </w:t>
+      </w:r>
+      <w:r>
+        <w:rPr>
+          <w:b/>
+          <w:bCs/>
+        </w:rPr>
+        <w:t>three levels</w:t>
+      </w:r>
+      <w:r>
+        <w:t>.</w:t>
+      </w:r>
+    </w:p>
+    <w:p>
+      <w:r>
+        <w:pict w14:anchorId="27E6B232">
+          <v:rect id="_x0000_i1155" style="width:0;height:1.5pt" o:hralign="center" o:hrstd="t" o:hr="t" fillcolor="#a0a0a0" stroked="f"/>
+        </w:pict>
+      </w:r>
+    </w:p>
+    <w:p>
+      <w:pPr>
+        <w:rPr>
+          <w:b/>
+          <w:bCs/>
+        </w:rPr>
+      </w:pPr>
+      <w:r>
+        <w:rPr>
+          <w:b/>
+          <w:bCs/>
+        </w:rPr>
+        <w:t>Level 1 – Knowledge-Based Benchmarks (Phase 2 MVP)</w:t>
+      </w:r>
+    </w:p>
+    <w:p>
+      <w:r>
+        <w:t>These are based on:</w:t>
+      </w:r>
+    </w:p>
+    <w:p>
+      <w:pPr>
+        <w:numPr>
+          <w:ilvl w:val="0"/>
+          <w:numId w:val="13"/>
+        </w:numPr>
+      </w:pPr>
+      <w:r>
+        <w:t>Industry best practices</w:t>
+      </w:r>
+    </w:p>
+    <w:p>
+      <w:pPr>
+        <w:numPr>
+          <w:ilvl w:val="0"/>
+          <w:numId w:val="13"/>
+        </w:numPr>
+      </w:pPr>
+      <w:r>
+        <w:t>Gartner</w:t>
+      </w:r>
+    </w:p>
+    <w:p>
+      <w:pPr>
+        <w:numPr>
+          <w:ilvl w:val="0"/>
+          <w:numId w:val="13"/>
+        </w:numPr>
+      </w:pPr>
+      <w:r>
+        <w:t>McKinsey</w:t>
+      </w:r>
+    </w:p>
+    <w:p>
+      <w:pPr>
+        <w:numPr>
+          <w:ilvl w:val="0"/>
+          <w:numId w:val="13"/>
+        </w:numPr>
+      </w:pPr>
+      <w:r>
+        <w:t>Deloitte</w:t>
+      </w:r>
+    </w:p>
+    <w:p>
+      <w:pPr>
+        <w:numPr>
+          <w:ilvl w:val="0"/>
+          <w:numId w:val="13"/>
+        </w:numPr>
+      </w:pPr>
+      <w:r>
+        <w:t>Microsoft</w:t>
+      </w:r>
+    </w:p>
+    <w:p>
+      <w:pPr>
+        <w:numPr>
+          <w:ilvl w:val="0"/>
+          <w:numId w:val="13"/>
+        </w:numPr>
+      </w:pPr>
+      <w:r>
+        <w:t>IBM</w:t>
+      </w:r>
+    </w:p>
+    <w:p>
+      <w:pPr>
+        <w:numPr>
+          <w:ilvl w:val="0"/>
+          <w:numId w:val="13"/>
+        </w:numPr>
+      </w:pPr>
+      <w:r>
+        <w:t>Google Cloud</w:t>
+      </w:r>
+    </w:p>
+    <w:p>
+      <w:pPr>
+        <w:numPr>
+          <w:ilvl w:val="0"/>
+          <w:numId w:val="13"/>
+        </w:numPr>
+      </w:pPr>
+      <w:r>
+        <w:t>AWS</w:t>
+      </w:r>
+    </w:p>
+    <w:p>
+      <w:pPr>
+        <w:numPr>
+          <w:ilvl w:val="0"/>
+          <w:numId w:val="13"/>
+        </w:numPr>
+      </w:pPr>
+      <w:r>
+        <w:t>DORA (Engineering)</w:t>
+      </w:r>
+    </w:p>
+    <w:p>
+      <w:pPr>
+        <w:numPr>
+          <w:ilvl w:val="0"/>
+          <w:numId w:val="13"/>
+        </w:numPr>
+      </w:pPr>
+      <w:r>
+        <w:t>NIST AI RMF</w:t>
+      </w:r>
+    </w:p>
+    <w:p>
+      <w:pPr>
+        <w:numPr>
+          <w:ilvl w:val="0"/>
+          <w:numId w:val="13"/>
+        </w:numPr>
+      </w:pPr>
+      <w:r>
+        <w:t>ISO 42001</w:t>
+      </w:r>
+    </w:p>
+    <w:p>
+      <w:pPr>
+        <w:numPr>
+          <w:ilvl w:val="0"/>
+          <w:numId w:val="13"/>
+        </w:numPr>
+      </w:pPr>
+      <w:r>
+        <w:t>Industry reports</w:t>
+      </w:r>
+    </w:p>
+    <w:p>
+      <w:r>
+        <w:t>For example:</w:t>
+      </w:r>
+    </w:p>
+    <w:p>
+      <w:pPr>
+        <w:rPr>
+          <w:b/>
+          <w:bCs/>
+        </w:rPr>
+      </w:pPr>
+      <w:r>
+        <w:rPr>
+          <w:b/>
+          <w:bCs/>
+        </w:rPr>
+        <w:t>AI Readiness</w:t>
+      </w:r>
+    </w:p>
+    <w:tbl>
+      <w:tblPr>
+        <w:tblW w:w="0" w:type="auto"/>
+        <w:tblCellSpacing w:w="15" w:type="dxa"/>
+        <w:tblCellMar>
+          <w:top w:w="15" w:type="dxa"/>
+          <w:left w:w="15" w:type="dxa"/>
+          <w:bottom w:w="15" w:type="dxa"/>
+          <w:right w:w="15" w:type="dxa"/>
+        </w:tblCellMar>
+        <w:tblLook w:val="04A0" w:firstRow="1" w:lastRow="0" w:firstColumn="1" w:lastColumn="0" w:noHBand="0" w:noVBand="1"/>
+      </w:tblPr>
+      <w:tblGrid>
+        <w:gridCol w:w="1152"/>
+        <w:gridCol w:w="588"/>
+        <w:gridCol w:w="1603"/>
+        <w:gridCol w:w="1227"/>
+      </w:tblGrid>
+      <w:tr>
+        <w:trPr>
+          <w:tblHeader/>
+          <w:tblCellSpacing w:w="15" w:type="dxa"/>
+        </w:trPr>
+        <w:tc>
+          <w:tcPr>
+            <w:tcW w:w="0" w:type="auto"/>
+            <w:vAlign w:val="center"/>
+            <w:hideMark/>
+          </w:tcPr>
+          <w:p>
+            <w:pPr>
+              <w:rPr>
+                <w:b/>
+                <w:bCs/>
+              </w:rPr>
+            </w:pPr>
+            <w:r>
+              <w:rPr>
+                <w:b/>
+                <w:bCs/>
+              </w:rPr>
+              <w:t>Capability</w:t>
+            </w:r>
+          </w:p>
+        </w:tc>
+        <w:tc>
+          <w:tcPr>
+            <w:tcW w:w="0" w:type="auto"/>
+            <w:vAlign w:val="center"/>
+            <w:hideMark/>
+          </w:tcPr>
+          <w:p>
+            <w:pPr>
+              <w:rPr>
+                <w:b/>
+                <w:bCs/>
+              </w:rPr>
+            </w:pPr>
+            <w:r>
+              <w:rPr>
+                <w:b/>
+                <w:bCs/>
+              </w:rPr>
+              <w:t>Client</w:t>
+            </w:r>
+          </w:p>
+        </w:tc>
+        <w:tc>
+          <w:tcPr>
+            <w:tcW w:w="0" w:type="auto"/>
+            <w:vAlign w:val="center"/>
+            <w:hideMark/>
+          </w:tcPr>
+          <w:p>
+            <w:pPr>
+              <w:rPr>
+                <w:b/>
+                <w:bCs/>
+              </w:rPr>
+            </w:pPr>
+            <w:r>
+              <w:rPr>
+                <w:b/>
+                <w:bCs/>
+              </w:rPr>
+              <w:t>Industry Average</w:t>
+            </w:r>
+          </w:p>
+        </w:tc>
+        <w:tc>
+          <w:tcPr>
+            <w:tcW w:w="0" w:type="auto"/>
+            <w:vAlign w:val="center"/>
+            <w:hideMark/>
+          </w:tcPr>
+          <w:p>
+            <w:pPr>
+              <w:rPr>
+                <w:b/>
+                <w:bCs/>
+              </w:rPr>
+            </w:pPr>
+            <w:r>
+              <w:rPr>
+                <w:b/>
+                <w:bCs/>
+              </w:rPr>
+              <w:t>Best-in-Class</w:t>
+            </w:r>
+          </w:p>
+        </w:tc>
+      </w:tr>
+      <w:tr>
+        <w:trPr>
+          <w:tblCellSpacing w:w="15" w:type="dxa"/>
+        </w:trPr>
+        <w:tc>
+          <w:tcPr>
+            <w:tcW w:w="0" w:type="auto"/>
+            <w:vAlign w:val="center"/>
+            <w:hideMark/>
+          </w:tcPr>
+          <w:p>
+            <w:r>
+              <w:t>Leadership</w:t>
+            </w:r>
+          </w:p>
+        </w:tc>
+        <w:tc>
+          <w:tcPr>
+            <w:tcW w:w="0" w:type="auto"/>
+            <w:vAlign w:val="center"/>
+            <w:hideMark/>
+          </w:tcPr>
+          <w:p>
+            <w:r>
+              <w:t>4.2</w:t>
+            </w:r>
+          </w:p>
+        </w:tc>
+        <w:tc>
+          <w:tcPr>
+            <w:tcW w:w="0" w:type="auto"/>
+            <w:vAlign w:val="center"/>
+            <w:hideMark/>
+          </w:tcPr>
+          <w:p>
+            <w:r>
+              <w:t>3.5</w:t>
+            </w:r>
+          </w:p>
+        </w:tc>
+        <w:tc>
+          <w:tcPr>
+            <w:tcW w:w="0" w:type="auto"/>
+            <w:vAlign w:val="center"/>
+            <w:hideMark/>
+          </w:tcPr>
+          <w:p>
+            <w:r>
+              <w:t>4.8</w:t>
+            </w:r>
+          </w:p>
+        </w:tc>
+      </w:tr>
+      <w:tr>
+        <w:trPr>
+          <w:tblCellSpacing w:w="15" w:type="dxa"/>
+        </w:trPr>
+        <w:tc>
+          <w:tcPr>
+            <w:tcW w:w="0" w:type="auto"/>
+            <w:vAlign w:val="center"/>
+            <w:hideMark/>
+          </w:tcPr>
+          <w:p>
+            <w:r>
+              <w:t>Data</w:t>
+            </w:r>
+          </w:p>
+        </w:tc>
+        <w:tc>
+          <w:tcPr>
+            <w:tcW w:w="0" w:type="auto"/>
+            <w:vAlign w:val="center"/>
+            <w:hideMark/>
+          </w:tcPr>
+          <w:p>
+            <w:r>
+              <w:t>2.8</w:t>
+            </w:r>
+          </w:p>
+        </w:tc>
+        <w:tc>
+          <w:tcPr>
+            <w:tcW w:w="0" w:type="auto"/>
+            <w:vAlign w:val="center"/>
+            <w:hideMark/>
+          </w:tcPr>
+          <w:p>
+            <w:r>
+              <w:t>3.1</w:t>
+            </w:r>
+          </w:p>
+        </w:tc>
+        <w:tc>
+          <w:tcPr>
+            <w:tcW w:w="0" w:type="auto"/>
+            <w:vAlign w:val="center"/>
+            <w:hideMark/>
+          </w:tcPr>
+          <w:p>
+            <w:r>
+              <w:t>4.7</w:t>
+            </w:r>
+          </w:p>
+        </w:tc>
+      </w:tr>
+      <w:tr>
+        <w:trPr>
+          <w:tblCellSpacing w:w="15" w:type="dxa"/>
+        </w:trPr>
+        <w:tc>
+          <w:tcPr>
+            <w:tcW w:w="0" w:type="auto"/>
+            <w:vAlign w:val="center"/>
+            <w:hideMark/>
+          </w:tcPr>
+          <w:p>
+            <w:r>
+              <w:t>Technology</w:t>
+            </w:r>
+          </w:p>
+        </w:tc>
+        <w:tc>
+          <w:tcPr>
+            <w:tcW w:w="0" w:type="auto"/>
+            <w:vAlign w:val="center"/>
+            <w:hideMark/>
+          </w:tcPr>
+          <w:p>
+            <w:r>
+              <w:t>3.7</w:t>
+            </w:r>
+          </w:p>
+        </w:tc>
+        <w:tc>
+          <w:tcPr>
+            <w:tcW w:w="0" w:type="auto"/>
+            <w:vAlign w:val="center"/>
+            <w:hideMark/>
+          </w:tcPr>
+          <w:p>
+            <w:r>
+              <w:t>3.6</w:t>
+            </w:r>
+          </w:p>
+        </w:tc>
+        <w:tc>
+          <w:tcPr>
+            <w:tcW w:w="0" w:type="auto"/>
+            <w:vAlign w:val="center"/>
+            <w:hideMark/>
+          </w:tcPr>
+          <w:p>
+            <w:r>
+              <w:t>4.8</w:t>
+            </w:r>
+          </w:p>
+        </w:tc>
+      </w:tr>
+      <w:tr>
+        <w:trPr>
+          <w:tblCellSpacing w:w="15" w:type="dxa"/>
+        </w:trPr>
+        <w:tc>
+          <w:tcPr>
+            <w:tcW w:w="0" w:type="auto"/>
+            <w:vAlign w:val="center"/>
+            <w:hideMark/>
+          </w:tcPr>
+          <w:p>
+            <w:r>
+              <w:lastRenderedPageBreak/>
+              <w:t>Governance</w:t>
+            </w:r>
+          </w:p>
+        </w:tc>
+        <w:tc>
+          <w:tcPr>
+            <w:tcW w:w="0" w:type="auto"/>
+            <w:vAlign w:val="center"/>
+            <w:hideMark/>
+          </w:tcPr>
+          <w:p>
+            <w:r>
+              <w:t>1.9</w:t>
+            </w:r>
+          </w:p>
+        </w:tc>
+        <w:tc>
+          <w:tcPr>
+            <w:tcW w:w="0" w:type="auto"/>
+            <w:vAlign w:val="center"/>
+            <w:hideMark/>
+          </w:tcPr>
+          <w:p>
+            <w:r>
+              <w:t>2.7</w:t>
+            </w:r>
+          </w:p>
+        </w:tc>
+        <w:tc>
+          <w:tcPr>
+            <w:tcW w:w="0" w:type="auto"/>
+            <w:vAlign w:val="center"/>
+            <w:hideMark/>
+          </w:tcPr>
+          <w:p>
+            <w:r>
+              <w:t>4.6</w:t>
+            </w:r>
+          </w:p>
+        </w:tc>
+      </w:tr>
+      <w:tr>
+        <w:trPr>
+          <w:tblCellSpacing w:w="15" w:type="dxa"/>
+        </w:trPr>
+        <w:tc>
+          <w:tcPr>
+            <w:tcW w:w="0" w:type="auto"/>
+            <w:vAlign w:val="center"/>
+            <w:hideMark/>
+          </w:tcPr>
+          <w:p>
+            <w:r>
+              <w:t>Skills</w:t>
+            </w:r>
+          </w:p>
+        </w:tc>
+        <w:tc>
+          <w:tcPr>
+            <w:tcW w:w="0" w:type="auto"/>
+            <w:vAlign w:val="center"/>
+            <w:hideMark/>
+          </w:tcPr>
+          <w:p>
+            <w:r>
+              <w:t>2.4</w:t>
+            </w:r>
+          </w:p>
+        </w:tc>
+        <w:tc>
+          <w:tcPr>
+            <w:tcW w:w="0" w:type="auto"/>
+            <w:vAlign w:val="center"/>
+            <w:hideMark/>
+          </w:tcPr>
+          <w:p>
+            <w:r>
+              <w:t>2.8</w:t>
+            </w:r>
+          </w:p>
+        </w:tc>
+        <w:tc>
+          <w:tcPr>
+            <w:tcW w:w="0" w:type="auto"/>
+            <w:vAlign w:val="center"/>
+            <w:hideMark/>
+          </w:tcPr>
+          <w:p>
+            <w:r>
+              <w:t>4.5</w:t>
+            </w:r>
+          </w:p>
+        </w:tc>
+      </w:tr>
+    </w:tbl>
+    <w:p>
+      <w:r>
+        <w:t>Immediately the CEO can see:</w:t>
+      </w:r>
+    </w:p>
+    <w:p>
+      <w:r>
+        <w:t>Governance is below industry average.</w:t>
+      </w:r>
+    </w:p>
+    <w:p>
+      <w:r>
+        <w:pict w14:anchorId="584EE395">
+          <v:rect id="_x0000_i1156" style="width:0;height:1.5pt" o:hralign="center" o:hrstd="t" o:hr="t" fillcolor="#a0a0a0" stroked="f"/>
+        </w:pict>
+      </w:r>
+    </w:p>
+    <w:p>
+      <w:pPr>
+        <w:rPr>
+          <w:b/>
+          <w:bCs/>
+        </w:rPr>
+      </w:pPr>
+      <w:r>
+        <w:rPr>
+          <w:b/>
+          <w:bCs/>
+        </w:rPr>
+        <w:t>Level 2 – Nisol Benchmark Library</w:t>
+      </w:r>
+    </w:p>
+    <w:p>
+      <w:r>
+        <w:t>This is where your intellectual property begins.</w:t>
+      </w:r>
+    </w:p>
+    <w:p>
+      <w:r>
+        <w:t>For example:</w:t>
+      </w:r>
+    </w:p>
+    <w:p>
+      <w:r>
+        <w:t>Manufacturing</w:t>
+      </w:r>
+    </w:p>
+    <w:p/>
+    <w:p>
+      <w:r>
+        <w:t>Leadership</w:t>
+      </w:r>
+    </w:p>
+    <w:p>
+      <w:r>
+        <w:t>3.5</w:t>
+      </w:r>
+    </w:p>
+    <w:p/>
+    <w:p>
+      <w:r>
+        <w:t>Data</w:t>
+      </w:r>
+    </w:p>
+    <w:p>
+      <w:r>
+        <w:t>3.2</w:t>
+      </w:r>
+    </w:p>
+    <w:p/>
+    <w:p>
+      <w:r>
+        <w:t>Technology</w:t>
+      </w:r>
+    </w:p>
+    <w:p>
+      <w:r>
+        <w:t>3.6</w:t>
+      </w:r>
+    </w:p>
+    <w:p/>
+    <w:p>
+      <w:r>
+        <w:t>Processes</w:t>
+      </w:r>
+    </w:p>
+    <w:p>
+      <w:r>
+        <w:t>3.8</w:t>
+      </w:r>
+    </w:p>
+    <w:p/>
+    <w:p>
+      <w:r>
+        <w:t>Skills</w:t>
+      </w:r>
+    </w:p>
+    <w:p>
+      <w:r>
+        <w:t>2.7</w:t>
+      </w:r>
+    </w:p>
+    <w:p/>
+    <w:p>
+      <w:r>
+        <w:t>Security</w:t>
+      </w:r>
+    </w:p>
+    <w:p>
+      <w:r>
+        <w:t>4.0</w:t>
+      </w:r>
+    </w:p>
+    <w:p>
+      <w:r>
+        <w:t>For Healthcare</w:t>
+      </w:r>
+    </w:p>
+    <w:p>
+      <w:r>
+        <w:t>Leadership</w:t>
+      </w:r>
+    </w:p>
+    <w:p>
+      <w:r>
+        <w:lastRenderedPageBreak/>
+        <w:t>4.0</w:t>
+      </w:r>
+    </w:p>
+    <w:p/>
+    <w:p>
+      <w:r>
+        <w:t>Data</w:t>
+      </w:r>
+    </w:p>
+    <w:p>
+      <w:r>
+        <w:t>3.8</w:t>
+      </w:r>
+    </w:p>
+    <w:p/>
+    <w:p>
+      <w:r>
+        <w:t>Technology</w:t>
+      </w:r>
+    </w:p>
+    <w:p>
+      <w:r>
+        <w:t>3.5</w:t>
+      </w:r>
+    </w:p>
+    <w:p/>
+    <w:p>
+      <w:r>
+        <w:t>Compliance</w:t>
+      </w:r>
+    </w:p>
+    <w:p>
+      <w:r>
+        <w:t>4.8</w:t>
+      </w:r>
+    </w:p>
+    <w:p/>
+    <w:p>
+      <w:r>
+        <w:t>Skills</w:t>
+      </w:r>
+    </w:p>
+    <w:p>
+      <w:r>
+        <w:t>2.5</w:t>
+      </w:r>
+    </w:p>
+    <w:p>
+      <w:r>
+        <w:t>For BFSI</w:t>
+      </w:r>
+    </w:p>
+    <w:p>
+      <w:r>
+        <w:t>Leadership</w:t>
+      </w:r>
+    </w:p>
+    <w:p>
+      <w:r>
+        <w:t>4.1</w:t>
+      </w:r>
+    </w:p>
+    <w:p/>
+    <w:p>
+      <w:r>
+        <w:t>Data</w:t>
+      </w:r>
+    </w:p>
+    <w:p>
+      <w:r>
+        <w:t>4.2</w:t>
+      </w:r>
+    </w:p>
+    <w:p/>
+    <w:p>
+      <w:r>
+        <w:t>Security</w:t>
+      </w:r>
+    </w:p>
+    <w:p>
+      <w:r>
+        <w:t>4.8</w:t>
+      </w:r>
+    </w:p>
+    <w:p/>
+    <w:p>
+      <w:r>
+        <w:t>Governance</w:t>
+      </w:r>
+    </w:p>
+    <w:p>
+      <w:r>
+        <w:t>4.5</w:t>
+      </w:r>
+    </w:p>
+    <w:p/>
+    <w:p>
+      <w:r>
+        <w:t>Technology</w:t>
+      </w:r>
+    </w:p>
+    <w:p>
+      <w:r>
+        <w:t>4.1</w:t>
+      </w:r>
+    </w:p>
+    <w:p>
+      <w:r>
+        <w:t>You curate these benchmark profiles based on reputable research and your consulting experience. Over time, you refine them as you gather more client data.</w:t>
+      </w:r>
+    </w:p>
+    <w:p>
+      <w:r>
+        <w:pict w14:anchorId="657DA68A">
+          <v:rect id="_x0000_i1157" style="width:0;height:1.5pt" o:hralign="center" o:hrstd="t" o:hr="t" fillcolor="#a0a0a0" stroked="f"/>
+        </w:pict>
+      </w:r>
+    </w:p>
+    <w:p>
+      <w:pPr>
+        <w:rPr>
+          <w:b/>
+          <w:bCs/>
+        </w:rPr>
+      </w:pPr>
+      <w:r>
+        <w:rPr>
+          <w:b/>
+          <w:bCs/>
+        </w:rPr>
+        <w:lastRenderedPageBreak/>
+        <w:t>Level 3 – Live Nisol Intelligence Benchmark</w:t>
+      </w:r>
+    </w:p>
+    <w:p>
+      <w:r>
+        <w:t>This is your long-term competitive advantage.</w:t>
+      </w:r>
+    </w:p>
+    <w:p>
+      <w:r>
+        <w:t>Suppose after 3 years:</w:t>
+      </w:r>
+    </w:p>
+    <w:p>
+      <w:pPr>
+        <w:numPr>
+          <w:ilvl w:val="0"/>
+          <w:numId w:val="14"/>
+        </w:numPr>
+      </w:pPr>
+      <w:r>
+        <w:t>300 companies</w:t>
+      </w:r>
+    </w:p>
+    <w:p>
+      <w:pPr>
+        <w:numPr>
+          <w:ilvl w:val="0"/>
+          <w:numId w:val="14"/>
+        </w:numPr>
+      </w:pPr>
+      <w:r>
+        <w:t>40 manufacturing</w:t>
+      </w:r>
+    </w:p>
+    <w:p>
+      <w:pPr>
+        <w:numPr>
+          <w:ilvl w:val="0"/>
+          <w:numId w:val="14"/>
+        </w:numPr>
+      </w:pPr>
+      <w:r>
+        <w:t>55 BFSI</w:t>
+      </w:r>
+    </w:p>
+    <w:p>
+      <w:pPr>
+        <w:numPr>
+          <w:ilvl w:val="0"/>
+          <w:numId w:val="14"/>
+        </w:numPr>
+      </w:pPr>
+      <w:r>
+        <w:t>80 IT companies</w:t>
+      </w:r>
+    </w:p>
+    <w:p>
+      <w:pPr>
+        <w:numPr>
+          <w:ilvl w:val="0"/>
+          <w:numId w:val="14"/>
+        </w:numPr>
+      </w:pPr>
+      <w:r>
+        <w:t>60 healthcare</w:t>
+      </w:r>
+    </w:p>
+    <w:p>
+      <w:pPr>
+        <w:numPr>
+          <w:ilvl w:val="0"/>
+          <w:numId w:val="14"/>
+        </w:numPr>
+      </w:pPr>
+      <w:r>
+        <w:t>65 retail</w:t>
+      </w:r>
+    </w:p>
+    <w:p>
+      <w:r>
+        <w:t>Now your benchmark becomes:</w:t>
+      </w:r>
+    </w:p>
+    <w:p>
+      <w:r>
+        <w:t>Your Company</w:t>
+      </w:r>
+    </w:p>
+    <w:p/>
+    <w:p>
+      <w:r>
+        <w:t>72%</w:t>
+      </w:r>
+    </w:p>
+    <w:p/>
+    <w:p>
+      <w:r>
+        <w:t>Manufacturing Average</w:t>
+      </w:r>
+    </w:p>
+    <w:p/>
+    <w:p>
+      <w:r>
+        <w:t>61%</w:t>
+      </w:r>
+    </w:p>
+    <w:p/>
+    <w:p>
+      <w:r>
+        <w:t>Top 25%</w:t>
+      </w:r>
+    </w:p>
+    <w:p/>
+    <w:p>
+      <w:r>
+        <w:t>84%</w:t>
+      </w:r>
+    </w:p>
+    <w:p/>
+    <w:p>
+      <w:r>
+        <w:t>Top 10%</w:t>
+      </w:r>
+    </w:p>
+    <w:p/>
+    <w:p>
+      <w:r>
+        <w:t>91%</w:t>
+      </w:r>
+    </w:p>
+    <w:p>
+      <w:r>
+        <w:t>This is similar to how platforms like Salesforce, Culture Amp, and Qualtrics benchmark customers against anonymized peers.</w:t>
+      </w:r>
+    </w:p>
+    <w:p>
+      <w:r>
+        <w:pict w14:anchorId="206AED0D">
+          <v:rect id="_x0000_i1158" style="width:0;height:1.5pt" o:hralign="center" o:hrstd="t" o:hr="t" fillcolor="#a0a0a0" stroked="f"/>
+        </w:pict>
+      </w:r>
+    </w:p>
+    <w:p>
+      <w:pPr>
+        <w:rPr>
+          <w:b/>
+          <w:bCs/>
+        </w:rPr>
+      </w:pPr>
+      <w:r>
+        <w:rPr>
+          <w:b/>
+          <w:bCs/>
+        </w:rPr>
+        <w:t>Benchmark Dimensions</w:t>
+      </w:r>
+    </w:p>
+    <w:p>
+      <w:r>
+        <w:t>I would benchmark every capability.</w:t>
+      </w:r>
+    </w:p>
+    <w:p>
+      <w:pPr>
+        <w:rPr>
+          <w:b/>
+          <w:bCs/>
+        </w:rPr>
+      </w:pPr>
+      <w:r>
+        <w:rPr>
+          <w:b/>
+          <w:bCs/>
+        </w:rPr>
+        <w:t>AI Readiness</w:t>
+      </w:r>
+    </w:p>
+    <w:p>
+      <w:r>
+        <w:lastRenderedPageBreak/>
+        <w:t>Leadership</w:t>
+      </w:r>
+    </w:p>
+    <w:p>
+      <w:r>
+        <w:t>Technology</w:t>
+      </w:r>
+    </w:p>
+    <w:p>
+      <w:r>
+        <w:t>Data</w:t>
+      </w:r>
+    </w:p>
+    <w:p>
+      <w:r>
+        <w:t>Processes</w:t>
+      </w:r>
+    </w:p>
+    <w:p>
+      <w:r>
+        <w:t>Security</w:t>
+      </w:r>
+    </w:p>
+    <w:p>
+      <w:r>
+        <w:t>Governance</w:t>
+      </w:r>
+    </w:p>
+    <w:p>
+      <w:r>
+        <w:t>Skills</w:t>
+      </w:r>
+    </w:p>
+    <w:p>
+      <w:r>
+        <w:t>Culture</w:t>
+      </w:r>
+    </w:p>
+    <w:p>
+      <w:r>
+        <w:pict w14:anchorId="4114DB4C">
+          <v:rect id="_x0000_i1159" style="width:0;height:1.5pt" o:hralign="center" o:hrstd="t" o:hr="t" fillcolor="#a0a0a0" stroked="f"/>
+        </w:pict>
+      </w:r>
+    </w:p>
+    <w:p>
+      <w:pPr>
+        <w:rPr>
+          <w:b/>
+          <w:bCs/>
+        </w:rPr>
+      </w:pPr>
+      <w:r>
+        <w:rPr>
+          <w:b/>
+          <w:bCs/>
+        </w:rPr>
+        <w:t>Business Capability</w:t>
+      </w:r>
+    </w:p>
+    <w:p>
+      <w:r>
+        <w:t>Sales</w:t>
+      </w:r>
+    </w:p>
+    <w:p>
+      <w:r>
+        <w:t>Marketing</w:t>
+      </w:r>
+    </w:p>
+    <w:p>
+      <w:r>
+        <w:t>Finance</w:t>
+      </w:r>
+    </w:p>
+    <w:p>
+      <w:r>
+        <w:t>HR</w:t>
+      </w:r>
+    </w:p>
+    <w:p>
+      <w:r>
+        <w:t>Operations</w:t>
+      </w:r>
+    </w:p>
+    <w:p>
+      <w:r>
+        <w:t>Procurement</w:t>
+      </w:r>
+    </w:p>
+    <w:p>
+      <w:r>
+        <w:t>Customer Support</w:t>
+      </w:r>
+    </w:p>
+    <w:p>
+      <w:r>
+        <w:t>Engineering</w:t>
+      </w:r>
+    </w:p>
+    <w:p>
+      <w:r>
+        <w:t>Legal</w:t>
+      </w:r>
+    </w:p>
+    <w:p>
+      <w:r>
+        <w:pict w14:anchorId="582DC8B3">
+          <v:rect id="_x0000_i1160" style="width:0;height:1.5pt" o:hralign="center" o:hrstd="t" o:hr="t" fillcolor="#a0a0a0" stroked="f"/>
+        </w:pict>
+      </w:r>
+    </w:p>
+    <w:p>
+      <w:pPr>
+        <w:rPr>
+          <w:b/>
+          <w:bCs/>
+        </w:rPr>
+      </w:pPr>
+      <w:r>
+        <w:rPr>
+          <w:b/>
+          <w:bCs/>
+        </w:rPr>
+        <w:t>Engineering Capability</w:t>
+      </w:r>
+    </w:p>
+    <w:p>
+      <w:r>
+        <w:t>DORA</w:t>
+      </w:r>
+    </w:p>
+    <w:p>
+      <w:r>
+        <w:t>Deployment Frequency</w:t>
+      </w:r>
+    </w:p>
+    <w:p>
+      <w:r>
+        <w:t>Lead Time</w:t>
+      </w:r>
+    </w:p>
+    <w:p>
+      <w:r>
+        <w:t>MTTR</w:t>
+      </w:r>
+    </w:p>
+    <w:p>
+      <w:r>
+        <w:t>Change Failure Rate</w:t>
+      </w:r>
+    </w:p>
+    <w:p>
+      <w:r>
+        <w:t>PR Review Time</w:t>
+      </w:r>
+    </w:p>
+    <w:p>
+      <w:r>
+        <w:t>Code Quality</w:t>
+      </w:r>
+    </w:p>
+    <w:p>
+      <w:r>
+        <w:t>AI Adoption</w:t>
+      </w:r>
+    </w:p>
+    <w:p>
+      <w:r>
+        <w:t>Developer Experience</w:t>
+      </w:r>
+    </w:p>
+    <w:p>
+      <w:r>
+        <w:pict w14:anchorId="6F796FEA">
+          <v:rect id="_x0000_i1161" style="width:0;height:1.5pt" o:hralign="center" o:hrstd="t" o:hr="t" fillcolor="#a0a0a0" stroked="f"/>
+        </w:pict>
+      </w:r>
+    </w:p>
+    <w:p>
+      <w:pPr>
+        <w:rPr>
+          <w:b/>
+          <w:bCs/>
+        </w:rPr>
+      </w:pPr>
+      <w:r>
+        <w:rPr>
+          <w:b/>
+          <w:bCs/>
+        </w:rPr>
+        <w:lastRenderedPageBreak/>
+        <w:t>AI Adoption</w:t>
+      </w:r>
+    </w:p>
+    <w:p>
+      <w:r>
+        <w:t>AI Usage</w:t>
+      </w:r>
+    </w:p>
+    <w:p>
+      <w:r>
+        <w:t>AI Agents</w:t>
+      </w:r>
+    </w:p>
+    <w:p>
+      <w:r>
+        <w:t>AI Assistants</w:t>
+      </w:r>
+    </w:p>
+    <w:p>
+      <w:r>
+        <w:t>Automation</w:t>
+      </w:r>
+    </w:p>
+    <w:p>
+      <w:r>
+        <w:t>AI ROI</w:t>
+      </w:r>
+    </w:p>
+    <w:p>
+      <w:r>
+        <w:t>Business Value</w:t>
+      </w:r>
+    </w:p>
+    <w:p>
+      <w:r>
+        <w:t>Innovation</w:t>
+      </w:r>
+    </w:p>
+    <w:p>
+      <w:r>
+        <w:pict w14:anchorId="20C74BA3">
+          <v:rect id="_x0000_i1162" style="width:0;height:1.5pt" o:hralign="center" o:hrstd="t" o:hr="t" fillcolor="#a0a0a0" stroked="f"/>
+        </w:pict>
+      </w:r>
+    </w:p>
+    <w:p>
+      <w:pPr>
+        <w:rPr>
+          <w:b/>
+          <w:bCs/>
+        </w:rPr>
+      </w:pPr>
+      <w:r>
+        <w:rPr>
+          <w:b/>
+          <w:bCs/>
+        </w:rPr>
+        <w:t>Transformation</w:t>
+      </w:r>
+    </w:p>
+    <w:p>
+      <w:r>
+        <w:t>Roadmap Progress</w:t>
+      </w:r>
+    </w:p>
+    <w:p>
+      <w:r>
+        <w:t>Implementation Progress</w:t>
+      </w:r>
+    </w:p>
+    <w:p>
+      <w:r>
+        <w:t>Investment</w:t>
+      </w:r>
+    </w:p>
+    <w:p>
+      <w:r>
+        <w:t>Business Outcomes</w:t>
+      </w:r>
+    </w:p>
+    <w:p>
+      <w:r>
+        <w:pict w14:anchorId="18AD67C9">
+          <v:rect id="_x0000_i1163" style="width:0;height:1.5pt" o:hralign="center" o:hrstd="t" o:hr="t" fillcolor="#a0a0a0" stroked="f"/>
+        </w:pict>
+      </w:r>
+    </w:p>
+    <w:p>
+      <w:pPr>
+        <w:rPr>
+          <w:b/>
+          <w:bCs/>
+        </w:rPr>
+      </w:pPr>
+      <w:r>
+        <w:rPr>
+          <w:b/>
+          <w:bCs/>
+        </w:rPr>
+        <w:t>Multiple Comparison Modes</w:t>
+      </w:r>
+    </w:p>
+    <w:p>
+      <w:r>
+        <w:t>Instead of a single comparison, let users choose the benchmark they want.</w:t>
+      </w:r>
+    </w:p>
+    <w:p>
+      <w:r>
+        <w:t>Compare Against</w:t>
+      </w:r>
+    </w:p>
+    <w:p/>
+    <w:p>
+      <w:r>
+        <w:t>○ Global Average</w:t>
+      </w:r>
+    </w:p>
+    <w:p/>
+    <w:p>
+      <w:r>
+        <w:t>○ Industry Average</w:t>
+      </w:r>
+    </w:p>
+    <w:p/>
+    <w:p>
+      <w:r>
+        <w:t>○ Company Size</w:t>
+      </w:r>
+    </w:p>
+    <w:p/>
+    <w:p>
+      <w:r>
+        <w:t>○ Geography</w:t>
+      </w:r>
+    </w:p>
+    <w:p/>
+    <w:p>
+      <w:r>
+        <w:t>○ Digital Leaders</w:t>
+      </w:r>
+    </w:p>
+    <w:p/>
+    <w:p>
+      <w:r>
+        <w:t>○ AI Leaders</w:t>
+      </w:r>
+    </w:p>
+    <w:p/>
+    <w:p>
+      <w:r>
+        <w:lastRenderedPageBreak/>
+        <w:t>○ Nisol Customers</w:t>
+      </w:r>
+    </w:p>
+    <w:p/>
+    <w:p>
+      <w:r>
+        <w:t>○ Previous Assessment</w:t>
+      </w:r>
+    </w:p>
+    <w:p/>
+    <w:p>
+      <w:r>
+        <w:t>○ Best Performing Department</w:t>
+      </w:r>
+    </w:p>
+    <w:p>
+      <w:r>
+        <w:t>This gives executives much richer context.</w:t>
+      </w:r>
+    </w:p>
+    <w:p>
+      <w:r>
+        <w:pict w14:anchorId="4F734D01">
+          <v:rect id="_x0000_i1164" style="width:0;height:1.5pt" o:hralign="center" o:hrstd="t" o:hr="t" fillcolor="#a0a0a0" stroked="f"/>
+        </w:pict>
+      </w:r>
+    </w:p>
+    <w:p>
+      <w:pPr>
+        <w:rPr>
+          <w:b/>
+          <w:bCs/>
+        </w:rPr>
+      </w:pPr>
+      <w:r>
+        <w:rPr>
+          <w:b/>
+          <w:bCs/>
+        </w:rPr>
+        <w:t>Dashboard Example</w:t>
+      </w:r>
+    </w:p>
+    <w:p>
+      <w:r>
+        <w:t>--------------------------------------------------------</w:t>
+      </w:r>
+    </w:p>
+    <w:p/>
+    <w:p>
+      <w:r>
+        <w:t xml:space="preserve">          AI BENCHMARK DASHBOARD</w:t>
+      </w:r>
+    </w:p>
+    <w:p/>
+    <w:p>
+      <w:r>
+        <w:t>Overall Score</w:t>
+      </w:r>
+    </w:p>
+    <w:p/>
+    <w:p>
+      <w:r>
+        <w:t>Your Company</w:t>
+      </w:r>
+    </w:p>
+    <w:p/>
+    <w:p>
+      <w:r>
+        <w:t>74%</w:t>
+      </w:r>
+    </w:p>
+    <w:p/>
+    <w:p>
+      <w:r>
+        <w:t>Industry</w:t>
+      </w:r>
+    </w:p>
+    <w:p/>
+    <w:p>
+      <w:r>
+        <w:t>63%</w:t>
+      </w:r>
+    </w:p>
+    <w:p/>
+    <w:p>
+      <w:r>
+        <w:t>Top Quartile</w:t>
+      </w:r>
+    </w:p>
+    <w:p/>
+    <w:p>
+      <w:r>
+        <w:t>82%</w:t>
+      </w:r>
+    </w:p>
+    <w:p/>
+    <w:p>
+      <w:r>
+        <w:t>Global Leaders</w:t>
+      </w:r>
+    </w:p>
+    <w:p/>
+    <w:p>
+      <w:r>
+        <w:t>91%</w:t>
+      </w:r>
+    </w:p>
+    <w:p/>
+    <w:p>
+      <w:r>
+        <w:t>--------------------------------------------------------</w:t>
+      </w:r>
+    </w:p>
+    <w:p/>
+    <w:p>
+      <w:r>
+        <w:t>Leadership</w:t>
+      </w:r>
+    </w:p>
+    <w:p/>
+    <w:p>
+      <w:r>
+        <w:rPr>
+          <w:rFonts w:ascii="Segoe UI Symbol" w:hAnsi="Segoe UI Symbol" w:cs="Segoe UI Symbol"/>
+        </w:rPr>
+        <w:t>★★★★★</w:t>
+      </w:r>
+    </w:p>
+    <w:p/>
+    <w:p>
+      <w:r>
+        <w:t>Top 20%</w:t>
+      </w:r>
+    </w:p>
+    <w:p/>
+    <w:p>
+      <w:r>
+        <w:t>Data</w:t>
+      </w:r>
+    </w:p>
+    <w:p/>
+    <w:p>
+      <w:r>
+        <w:rPr>
+          <w:rFonts w:ascii="Segoe UI Symbol" w:hAnsi="Segoe UI Symbol" w:cs="Segoe UI Symbol"/>
+        </w:rPr>
+        <w:t>★★★☆☆</w:t>
+      </w:r>
+    </w:p>
+    <w:p/>
+    <w:p>
+      <w:r>
+        <w:t>Below Industry</w:t>
+      </w:r>
+    </w:p>
+    <w:p/>
+    <w:p>
+      <w:r>
+        <w:t>Technology</w:t>
+      </w:r>
+    </w:p>
+    <w:p/>
+    <w:p>
+      <w:r>
+        <w:rPr>
+          <w:rFonts w:ascii="Segoe UI Symbol" w:hAnsi="Segoe UI Symbol" w:cs="Segoe UI Symbol"/>
+        </w:rPr>
+        <w:t>★★★★☆</w:t>
+      </w:r>
+    </w:p>
+    <w:p/>
+    <w:p>
+      <w:r>
+        <w:t>Industry Average</w:t>
+      </w:r>
+    </w:p>
+    <w:p/>
+    <w:p>
+      <w:r>
+        <w:t>Governance</w:t>
+      </w:r>
+    </w:p>
+    <w:p/>
+    <w:p>
+      <w:r>
+        <w:rPr>
+          <w:rFonts w:ascii="Segoe UI Symbol" w:hAnsi="Segoe UI Symbol" w:cs="Segoe UI Symbol"/>
+        </w:rPr>
+        <w:t>★★☆☆☆</w:t>
+      </w:r>
+    </w:p>
+    <w:p/>
+    <w:p>
+      <w:r>
+        <w:t>Needs Improvement</w:t>
+      </w:r>
+    </w:p>
+    <w:p/>
+    <w:p>
+      <w:r>
+        <w:t>Skills</w:t>
+      </w:r>
+    </w:p>
+    <w:p/>
+    <w:p>
+      <w:r>
+        <w:rPr>
+          <w:rFonts w:ascii="Segoe UI Symbol" w:hAnsi="Segoe UI Symbol" w:cs="Segoe UI Symbol"/>
+        </w:rPr>
+        <w:t>★★★☆☆</w:t>
+      </w:r>
+    </w:p>
+    <w:p/>
+    <w:p>
+      <w:r>
+        <w:t>Average</w:t>
+      </w:r>
+    </w:p>
+    <w:p/>
+    <w:p>
+      <w:r>
+        <w:lastRenderedPageBreak/>
+        <w:t>--------------------------------------------------------</w:t>
+      </w:r>
+    </w:p>
+    <w:p>
+      <w:r>
+        <w:pict w14:anchorId="155E080B">
+          <v:rect id="_x0000_i1165" style="width:0;height:1.5pt" o:hralign="center" o:hrstd="t" o:hr="t" fillcolor="#a0a0a0" stroked="f"/>
+        </w:pict>
+      </w:r>
+    </w:p>
+    <w:p>
+      <w:pPr>
+        <w:rPr>
+          <w:b/>
+          <w:bCs/>
+        </w:rPr>
+      </w:pPr>
+      <w:r>
+        <w:rPr>
+          <w:b/>
+          <w:bCs/>
+        </w:rPr>
+        <w:t>Department Benchmark</w:t>
+      </w:r>
+    </w:p>
+    <w:p>
+      <w:r>
+        <w:t>Engineering</w:t>
+      </w:r>
+    </w:p>
+    <w:p>
+      <w:r>
+        <w:t>Deployment Frequency</w:t>
+      </w:r>
+    </w:p>
+    <w:p/>
+    <w:p>
+      <w:r>
+        <w:t>You</w:t>
+      </w:r>
+    </w:p>
+    <w:p/>
+    <w:p>
+      <w:r>
+        <w:t>18/month</w:t>
+      </w:r>
+    </w:p>
+    <w:p/>
+    <w:p>
+      <w:r>
+        <w:t>Industry</w:t>
+      </w:r>
+    </w:p>
+    <w:p/>
+    <w:p>
+      <w:r>
+        <w:t>11/month</w:t>
+      </w:r>
+    </w:p>
+    <w:p/>
+    <w:p>
+      <w:r>
+        <w:t>Top Quartile</w:t>
+      </w:r>
+    </w:p>
+    <w:p/>
+    <w:p>
+      <w:r>
+        <w:t>29/month</w:t>
+      </w:r>
+    </w:p>
+    <w:p/>
+    <w:p>
+      <w:r>
+        <w:t>Global Elite</w:t>
+      </w:r>
+    </w:p>
+    <w:p/>
+    <w:p>
+      <w:r>
+        <w:t>48/month</w:t>
+      </w:r>
+    </w:p>
+    <w:p>
+      <w:r>
+        <w:pict w14:anchorId="536737F5">
+          <v:rect id="_x0000_i1166" style="width:0;height:1.5pt" o:hralign="center" o:hrstd="t" o:hr="t" fillcolor="#a0a0a0" stroked="f"/>
+        </w:pict>
+      </w:r>
+    </w:p>
+    <w:p>
+      <w:r>
+        <w:t>Sales</w:t>
+      </w:r>
+    </w:p>
+    <w:p>
+      <w:r>
+        <w:t>Proposal Creation</w:t>
+      </w:r>
+    </w:p>
+    <w:p/>
+    <w:p>
+      <w:r>
+        <w:t>You</w:t>
+      </w:r>
+    </w:p>
+    <w:p/>
+    <w:p>
+      <w:r>
+        <w:t>4 hours</w:t>
+      </w:r>
+    </w:p>
+    <w:p/>
+    <w:p>
+      <w:r>
+        <w:t>Industry</w:t>
+      </w:r>
+    </w:p>
+    <w:p/>
+    <w:p>
+      <w:r>
+        <w:lastRenderedPageBreak/>
+        <w:t>6 hours</w:t>
+      </w:r>
+    </w:p>
+    <w:p/>
+    <w:p>
+      <w:r>
+        <w:t>AI Leaders</w:t>
+      </w:r>
+    </w:p>
+    <w:p/>
+    <w:p>
+      <w:r>
+        <w:t>45 minutes</w:t>
+      </w:r>
+    </w:p>
+    <w:p>
+      <w:r>
+        <w:pict w14:anchorId="39DA810E">
+          <v:rect id="_x0000_i1167" style="width:0;height:1.5pt" o:hralign="center" o:hrstd="t" o:hr="t" fillcolor="#a0a0a0" stroked="f"/>
+        </w:pict>
+      </w:r>
+    </w:p>
+    <w:p>
+      <w:r>
+        <w:t>Finance</w:t>
+      </w:r>
+    </w:p>
+    <w:p>
+      <w:r>
+        <w:t>Invoice Processing</w:t>
+      </w:r>
+    </w:p>
+    <w:p/>
+    <w:p>
+      <w:r>
+        <w:t>You</w:t>
+      </w:r>
+    </w:p>
+    <w:p/>
+    <w:p>
+      <w:r>
+        <w:t>5 days</w:t>
+      </w:r>
+    </w:p>
+    <w:p/>
+    <w:p>
+      <w:r>
+        <w:t>Industry</w:t>
+      </w:r>
+    </w:p>
+    <w:p/>
+    <w:p>
+      <w:r>
+        <w:t>8 days</w:t>
+      </w:r>
+    </w:p>
+    <w:p/>
+    <w:p>
+      <w:r>
+        <w:t>Best Practice</w:t>
+      </w:r>
+    </w:p>
+    <w:p/>
+    <w:p>
+      <w:r>
+        <w:t>1 day</w:t>
+      </w:r>
+    </w:p>
+    <w:p>
+      <w:r>
+        <w:pict w14:anchorId="0E95C1C4">
+          <v:rect id="_x0000_i1168" style="width:0;height:1.5pt" o:hralign="center" o:hrstd="t" o:hr="t" fillcolor="#a0a0a0" stroked="f"/>
+        </w:pict>
+      </w:r>
+    </w:p>
+    <w:p>
+      <w:pPr>
+        <w:rPr>
+          <w:b/>
+          <w:bCs/>
+        </w:rPr>
+      </w:pPr>
+      <w:r>
+        <w:rPr>
+          <w:b/>
+          <w:bCs/>
+        </w:rPr>
+        <w:t>AI Recommendation Engine</w:t>
+      </w:r>
+    </w:p>
+    <w:p>
+      <w:r>
+        <w:t>The benchmark should drive recommendations, not just display scores.</w:t>
+      </w:r>
+    </w:p>
+    <w:p>
+      <w:r>
+        <w:t>For example:</w:t>
+      </w:r>
+    </w:p>
+    <w:p>
+      <w:r>
+        <w:rPr>
+          <w:b/>
+          <w:bCs/>
+        </w:rPr>
+        <w:t>Governance Score: 2.1/5</w:t>
+      </w:r>
+    </w:p>
+    <w:p>
+      <w:r>
+        <w:t xml:space="preserve">This is </w:t>
+      </w:r>
+      <w:r>
+        <w:rPr>
+          <w:b/>
+          <w:bCs/>
+        </w:rPr>
+        <w:t>18% below the industry average</w:t>
+      </w:r>
+      <w:r>
+        <w:t xml:space="preserve"> and </w:t>
+      </w:r>
+      <w:r>
+        <w:rPr>
+          <w:b/>
+          <w:bCs/>
+        </w:rPr>
+        <w:t>53% below top-performing organizations</w:t>
+      </w:r>
+      <w:r>
+        <w:t>. Organizations with governance scores above 4.0 are significantly more likely to scale AI successfully.</w:t>
+      </w:r>
+    </w:p>
+    <w:p>
+      <w:r>
+        <w:rPr>
+          <w:b/>
+          <w:bCs/>
+        </w:rPr>
+        <w:t>Recommended actions:</w:t>
+      </w:r>
+    </w:p>
+    <w:p>
+      <w:pPr>
+        <w:numPr>
+          <w:ilvl w:val="0"/>
+          <w:numId w:val="15"/>
+        </w:numPr>
+      </w:pPr>
+      <w:r>
+        <w:t>Establish an AI Governance Committee.</w:t>
+      </w:r>
+    </w:p>
+    <w:p>
+      <w:pPr>
+        <w:numPr>
+          <w:ilvl w:val="0"/>
+          <w:numId w:val="15"/>
+        </w:numPr>
+      </w:pPr>
+      <w:r>
+        <w:t>Define Responsible AI policies.</w:t>
+      </w:r>
+    </w:p>
+    <w:p>
+      <w:pPr>
+        <w:numPr>
+          <w:ilvl w:val="0"/>
+          <w:numId w:val="15"/>
+        </w:numPr>
+      </w:pPr>
+      <w:r>
+        <w:t>Create an AI Risk Register.</w:t>
+      </w:r>
+    </w:p>
+    <w:p>
+      <w:pPr>
+        <w:numPr>
+          <w:ilvl w:val="0"/>
+          <w:numId w:val="15"/>
+        </w:numPr>
+      </w:pPr>
+      <w:r>
+        <w:lastRenderedPageBreak/>
+        <w:t>Implement model lifecycle management.</w:t>
+      </w:r>
+    </w:p>
+    <w:p>
+      <w:r>
+        <w:t>This turns benchmarking into actionable consulting guidance.</w:t>
+      </w:r>
+    </w:p>
+    <w:p>
+      <w:pPr>
+        <w:rPr>
+          <w:b/>
+          <w:bCs/>
+        </w:rPr>
+      </w:pPr>
+      <w:r>
+        <w:rPr>
+          <w:b/>
+          <w:bCs/>
+        </w:rPr>
+        <w:t>My recommendation</w:t>
+      </w:r>
+    </w:p>
+    <w:p>
+      <w:r>
+        <w:t xml:space="preserve">I would make benchmarking a </w:t>
+      </w:r>
+      <w:r>
+        <w:rPr>
+          <w:b/>
+          <w:bCs/>
+        </w:rPr>
+        <w:t>core pillar of Nisol Intelligence</w:t>
+      </w:r>
+      <w:r>
+        <w:t xml:space="preserve">, not just another dashboard. The platform should have a dedicated </w:t>
+      </w:r>
+      <w:r>
+        <w:rPr>
+          <w:b/>
+          <w:bCs/>
+        </w:rPr>
+        <w:t>Benchmark Intelligence</w:t>
+      </w:r>
+      <w:r>
+        <w:t xml:space="preserve"> module with:</w:t>
+      </w:r>
+    </w:p>
+    <w:p>
+      <w:pPr>
+        <w:numPr>
+          <w:ilvl w:val="0"/>
+          <w:numId w:val="16"/>
+        </w:numPr>
+      </w:pPr>
+      <w:r>
+        <w:rPr>
+          <w:b/>
+          <w:bCs/>
+        </w:rPr>
+        <w:t>Global Benchmarks</w:t>
+      </w:r>
+      <w:r>
+        <w:t xml:space="preserve"> (based on respected public research and standards)</w:t>
+      </w:r>
+    </w:p>
+    <w:p>
+      <w:pPr>
+        <w:numPr>
+          <w:ilvl w:val="0"/>
+          <w:numId w:val="16"/>
+        </w:numPr>
+      </w:pPr>
+      <w:r>
+        <w:rPr>
+          <w:b/>
+          <w:bCs/>
+        </w:rPr>
+        <w:t>Industry Benchmarks</w:t>
+      </w:r>
+      <w:r>
+        <w:t xml:space="preserve"> (Manufacturing, BFSI, Healthcare, IT, Retail, etc.)</w:t>
+      </w:r>
+    </w:p>
+    <w:p>
+      <w:pPr>
+        <w:numPr>
+          <w:ilvl w:val="0"/>
+          <w:numId w:val="16"/>
+        </w:numPr>
+      </w:pPr>
+      <w:r>
+        <w:rPr>
+          <w:b/>
+          <w:bCs/>
+        </w:rPr>
+        <w:t>Capability Benchmarks</w:t>
+      </w:r>
+      <w:r>
+        <w:t xml:space="preserve"> (Leadership, Data, Engineering, Sales, HR, Finance, Security, etc.)</w:t>
+      </w:r>
+    </w:p>
+    <w:p>
+      <w:pPr>
+        <w:numPr>
+          <w:ilvl w:val="0"/>
+          <w:numId w:val="16"/>
+        </w:numPr>
+      </w:pPr>
+      <w:r>
+        <w:rPr>
+          <w:b/>
+          <w:bCs/>
+        </w:rPr>
+        <w:t>Historical Benchmarks</w:t>
+      </w:r>
+      <w:r>
+        <w:t xml:space="preserve"> (compare the client's current assessment to previous assessments)</w:t>
+      </w:r>
+    </w:p>
+    <w:p>
+      <w:pPr>
+        <w:numPr>
+          <w:ilvl w:val="0"/>
+          <w:numId w:val="16"/>
+        </w:numPr>
+      </w:pPr>
+      <w:r>
+        <w:rPr>
+          <w:b/>
+          <w:bCs/>
+        </w:rPr>
+        <w:t>Nisol Intelligence Benchmarks</w:t>
+      </w:r>
+      <w:r>
+        <w:t xml:space="preserve"> (anonymized comparisons built from your own customer base over time)</w:t>
+      </w:r>
+    </w:p>
+    <w:p>
+      <w:r>
+        <w:t>This gives clients meaningful context for every score and creates a long-term proprietary data asset that becomes more valuable as your platform grows.</w:t>
       </w:r>
     </w:p>
     <w:p/>
@@ -3630,6 +5697,119 @@
 <file path=word/numbering.xml><?xml version="1.0" encoding="utf-8"?>
 <w:numbering xmlns:wpc="http://schemas.microsoft.com/office/word/2010/wordprocessingCanvas" xmlns:cx="http://schemas.microsoft.com/office/drawing/2014/chartex" xmlns:cx1="http://schemas.microsoft.com/office/drawing/2015/9/8/chartex" xmlns:cx2="http://schemas.microsoft.com/office/drawing/2015/10/21/chartex" xmlns:cx3="http://schemas.microsoft.com/office/drawing/2016/5/9/chartex" xmlns:cx4="http://schemas.microsoft.com/office/drawing/2016/5/10/chartex" xmlns:cx5="http://schemas.microsoft.com/office/drawing/2016/5/11/chartex" xmlns:cx6="http://schemas.microsoft.com/office/drawing/2016/5/12/chartex" xmlns:cx7="http://schemas.microsoft.com/office/drawing/2016/5/13/chartex" xmlns:cx8="http://schemas.microsoft.com/office/drawing/2016/5/14/chartex" xmlns:mc="http://schemas.openxmlformats.org/markup-compatibility/2006" xmlns:aink="http://schemas.microsoft.com/office/drawing/2016/ink" xmlns:am3d="http://schemas.microsoft.com/office/drawing/2017/model3d" xmlns:o="urn:schemas-microsoft-com:office:office" xmlns:oel="http://schemas.microsoft.com/office/2019/extlst" xmlns:r="http://schemas.openxmlformats.org/officeDocument/2006/relationships" xmlns:m="http://schemas.openxmlformats.org/officeDocument/2006/math" xmlns:v="urn:schemas-microsoft-com:vml" xmlns:wp14="http://schemas.microsoft.com/office/word/2010/wordprocessingDrawing" xmlns:wp="http://schemas.openxmlformats.org/drawingml/2006/wordprocessingDrawing" xmlns:w10="urn:schemas-microsoft-com:office:word" xmlns:w="http://schemas.openxmlformats.org/wordprocessingml/2006/main" xmlns:w14="http://schemas.microsoft.com/office/word/2010/wordml" xmlns:w15="http://schemas.microsoft.com/office/word/2012/wordml" xmlns:w16cex="http://schemas.microsoft.com/office/word/2018/wordml/cex" xmlns:w16cid="http://schemas.microsoft.com/office/word/2016/wordml/cid" xmlns:w16="http://schemas.microsoft.com/office/word/2018/wordml" xmlns:w16du="http://schemas.microsoft.com/office/word/2023/wordml/word16du" xmlns:w16sdtdh="http://schemas.microsoft.com/office/word/2020/wordml/sdtdatahash" xmlns:w16sdtfl="http://schemas.microsoft.com/office/word/2024/wordml/sdtformatlock" xmlns:w16se="http://schemas.microsoft.com/office/word/2015/wordml/symex" xmlns:wpg="http://schemas.microsoft.com/office/word/2010/wordprocessingGroup" xmlns:wpi="http://schemas.microsoft.com/office/word/2010/wordprocessingInk" xmlns:wne="http://schemas.microsoft.com/office/word/2006/wordml" xmlns:wps="http://schemas.microsoft.com/office/word/2010/wordprocessingShape" mc:Ignorable="w14 w15 w16se w16cid w16 w16cex w16sdtdh w16sdtfl w16du wp14">
   <w:abstractNum w:abstractNumId="0" w15:restartNumberingAfterBreak="0">
+    <w:nsid w:val="00D47ACC"/>
+    <w:multiLevelType w:val="multilevel"/>
+    <w:tmpl w:val="676064EA"/>
+    <w:lvl w:ilvl="0">
+      <w:start w:val="1"/>
+      <w:numFmt w:val="decimal"/>
+      <w:lvlText w:val="%1."/>
+      <w:lvlJc w:val="left"/>
+      <w:pPr>
+        <w:tabs>
+          <w:tab w:val="num" w:pos="720"/>
+        </w:tabs>
+        <w:ind w:left="720" w:hanging="360"/>
+      </w:pPr>
+    </w:lvl>
+    <w:lvl w:ilvl="1" w:tentative="1">
+      <w:start w:val="1"/>
+      <w:numFmt w:val="decimal"/>
+      <w:lvlText w:val="%2."/>
+      <w:lvlJc w:val="left"/>
+      <w:pPr>
+        <w:tabs>
+          <w:tab w:val="num" w:pos="1440"/>
+        </w:tabs>
+        <w:ind w:left="1440" w:hanging="360"/>
+      </w:pPr>
+    </w:lvl>
+    <w:lvl w:ilvl="2" w:tentative="1">
+      <w:start w:val="1"/>
+      <w:numFmt w:val="decimal"/>
+      <w:lvlText w:val="%3."/>
+      <w:lvlJc w:val="left"/>
+      <w:pPr>
+        <w:tabs>
+          <w:tab w:val="num" w:pos="2160"/>
+        </w:tabs>
+        <w:ind w:left="2160" w:hanging="360"/>
+      </w:pPr>
+    </w:lvl>
+    <w:lvl w:ilvl="3" w:tentative="1">
+      <w:start w:val="1"/>
+      <w:numFmt w:val="decimal"/>
+      <w:lvlText w:val="%4."/>
+      <w:lvlJc w:val="left"/>
+      <w:pPr>
+        <w:tabs>
+          <w:tab w:val="num" w:pos="2880"/>
+        </w:tabs>
+        <w:ind w:left="2880" w:hanging="360"/>
+      </w:pPr>
+    </w:lvl>
+    <w:lvl w:ilvl="4" w:tentative="1">
+      <w:start w:val="1"/>
+      <w:numFmt w:val="decimal"/>
+      <w:lvlText w:val="%5."/>
+      <w:lvlJc w:val="left"/>
+      <w:pPr>
+        <w:tabs>
+          <w:tab w:val="num" w:pos="3600"/>
+        </w:tabs>
+        <w:ind w:left="3600" w:hanging="360"/>
+      </w:pPr>
+    </w:lvl>
+    <w:lvl w:ilvl="5" w:tentative="1">
+      <w:start w:val="1"/>
+      <w:numFmt w:val="decimal"/>
+      <w:lvlText w:val="%6."/>
+      <w:lvlJc w:val="left"/>
+      <w:pPr>
+        <w:tabs>
+          <w:tab w:val="num" w:pos="4320"/>
+        </w:tabs>
+        <w:ind w:left="4320" w:hanging="360"/>
+      </w:pPr>
+    </w:lvl>
+    <w:lvl w:ilvl="6" w:tentative="1">
+      <w:start w:val="1"/>
+      <w:numFmt w:val="decimal"/>
+      <w:lvlText w:val="%7."/>
+      <w:lvlJc w:val="left"/>
+      <w:pPr>
+        <w:tabs>
+          <w:tab w:val="num" w:pos="5040"/>
+        </w:tabs>
+        <w:ind w:left="5040" w:hanging="360"/>
+      </w:pPr>
+    </w:lvl>
+    <w:lvl w:ilvl="7" w:tentative="1">
+      <w:start w:val="1"/>
+      <w:numFmt w:val="decimal"/>
+      <w:lvlText w:val="%8."/>
+      <w:lvlJc w:val="left"/>
+      <w:pPr>
+        <w:tabs>
+          <w:tab w:val="num" w:pos="5760"/>
+        </w:tabs>
+        <w:ind w:left="5760" w:hanging="360"/>
+      </w:pPr>
+    </w:lvl>
+    <w:lvl w:ilvl="8" w:tentative="1">
+      <w:start w:val="1"/>
+      <w:numFmt w:val="decimal"/>
+      <w:lvlText w:val="%9."/>
+      <w:lvlJc w:val="left"/>
+      <w:pPr>
+        <w:tabs>
+          <w:tab w:val="num" w:pos="6480"/>
+        </w:tabs>
+        <w:ind w:left="6480" w:hanging="360"/>
+      </w:pPr>
+    </w:lvl>
+  </w:abstractNum>
+  <w:abstractNum w:abstractNumId="1" w15:restartNumberingAfterBreak="0">
     <w:nsid w:val="10B9399C"/>
     <w:multiLevelType w:val="multilevel"/>
     <w:tmpl w:val="87B6B438"/>
@@ -3778,7 +5958,7 @@
       </w:rPr>
     </w:lvl>
   </w:abstractNum>
-  <w:abstractNum w:abstractNumId="1" w15:restartNumberingAfterBreak="0">
+  <w:abstractNum w:abstractNumId="2" w15:restartNumberingAfterBreak="0">
     <w:nsid w:val="10CB6ECC"/>
     <w:multiLevelType w:val="multilevel"/>
     <w:tmpl w:val="8D64C1A4"/>
@@ -3927,7 +6107,156 @@
       </w:rPr>
     </w:lvl>
   </w:abstractNum>
-  <w:abstractNum w:abstractNumId="2" w15:restartNumberingAfterBreak="0">
+  <w:abstractNum w:abstractNumId="3" w15:restartNumberingAfterBreak="0">
+    <w:nsid w:val="12493F76"/>
+    <w:multiLevelType w:val="multilevel"/>
+    <w:tmpl w:val="C4D83C2A"/>
+    <w:lvl w:ilvl="0">
+      <w:start w:val="1"/>
+      <w:numFmt w:val="bullet"/>
+      <w:lvlText w:val=""/>
+      <w:lvlJc w:val="left"/>
+      <w:pPr>
+        <w:tabs>
+          <w:tab w:val="num" w:pos="720"/>
+        </w:tabs>
+        <w:ind w:left="720" w:hanging="360"/>
+      </w:pPr>
+      <w:rPr>
+        <w:rFonts w:ascii="Symbol" w:hAnsi="Symbol" w:hint="default"/>
+        <w:sz w:val="20"/>
+      </w:rPr>
+    </w:lvl>
+    <w:lvl w:ilvl="1" w:tentative="1">
+      <w:start w:val="1"/>
+      <w:numFmt w:val="bullet"/>
+      <w:lvlText w:val="o"/>
+      <w:lvlJc w:val="left"/>
+      <w:pPr>
+        <w:tabs>
+          <w:tab w:val="num" w:pos="1440"/>
+        </w:tabs>
+        <w:ind w:left="1440" w:hanging="360"/>
+      </w:pPr>
+      <w:rPr>
+        <w:rFonts w:ascii="Courier New" w:hAnsi="Courier New" w:hint="default"/>
+        <w:sz w:val="20"/>
+      </w:rPr>
+    </w:lvl>
+    <w:lvl w:ilvl="2" w:tentative="1">
+      <w:start w:val="1"/>
+      <w:numFmt w:val="bullet"/>
+      <w:lvlText w:val=""/>
+      <w:lvlJc w:val="left"/>
+      <w:pPr>
+        <w:tabs>
+          <w:tab w:val="num" w:pos="2160"/>
+        </w:tabs>
+        <w:ind w:left="2160" w:hanging="360"/>
+      </w:pPr>
+      <w:rPr>
+        <w:rFonts w:ascii="Wingdings" w:hAnsi="Wingdings" w:hint="default"/>
+        <w:sz w:val="20"/>
+      </w:rPr>
+    </w:lvl>
+    <w:lvl w:ilvl="3" w:tentative="1">
+      <w:start w:val="1"/>
+      <w:numFmt w:val="bullet"/>
+      <w:lvlText w:val=""/>
+      <w:lvlJc w:val="left"/>
+      <w:pPr>
+        <w:tabs>
+          <w:tab w:val="num" w:pos="2880"/>
+        </w:tabs>
+        <w:ind w:left="2880" w:hanging="360"/>
+      </w:pPr>
+      <w:rPr>
+        <w:rFonts w:ascii="Wingdings" w:hAnsi="Wingdings" w:hint="default"/>
+        <w:sz w:val="20"/>
+      </w:rPr>
+    </w:lvl>
+    <w:lvl w:ilvl="4" w:tentative="1">
+      <w:start w:val="1"/>
+      <w:numFmt w:val="bullet"/>
+      <w:lvlText w:val=""/>
+      <w:lvlJc w:val="left"/>
+      <w:pPr>
+        <w:tabs>
+          <w:tab w:val="num" w:pos="3600"/>
+        </w:tabs>
+        <w:ind w:left="3600" w:hanging="360"/>
+      </w:pPr>
+      <w:rPr>
+        <w:rFonts w:ascii="Wingdings" w:hAnsi="Wingdings" w:hint="default"/>
+        <w:sz w:val="20"/>
+      </w:rPr>
+    </w:lvl>
+    <w:lvl w:ilvl="5" w:tentative="1">
+      <w:start w:val="1"/>
+      <w:numFmt w:val="bullet"/>
+      <w:lvlText w:val=""/>
+      <w:lvlJc w:val="left"/>
+      <w:pPr>
+        <w:tabs>
+          <w:tab w:val="num" w:pos="4320"/>
+        </w:tabs>
+        <w:ind w:left="4320" w:hanging="360"/>
+      </w:pPr>
+      <w:rPr>
+        <w:rFonts w:ascii="Wingdings" w:hAnsi="Wingdings" w:hint="default"/>
+        <w:sz w:val="20"/>
+      </w:rPr>
+    </w:lvl>
+    <w:lvl w:ilvl="6" w:tentative="1">
+      <w:start w:val="1"/>
+      <w:numFmt w:val="bullet"/>
+      <w:lvlText w:val=""/>
+      <w:lvlJc w:val="left"/>
+      <w:pPr>
+        <w:tabs>
+          <w:tab w:val="num" w:pos="5040"/>
+        </w:tabs>
+        <w:ind w:left="5040" w:hanging="360"/>
+      </w:pPr>
+      <w:rPr>
+        <w:rFonts w:ascii="Wingdings" w:hAnsi="Wingdings" w:hint="default"/>
+        <w:sz w:val="20"/>
+      </w:rPr>
+    </w:lvl>
+    <w:lvl w:ilvl="7" w:tentative="1">
+      <w:start w:val="1"/>
+      <w:numFmt w:val="bullet"/>
+      <w:lvlText w:val=""/>
+      <w:lvlJc w:val="left"/>
+      <w:pPr>
+        <w:tabs>
+          <w:tab w:val="num" w:pos="5760"/>
+        </w:tabs>
+        <w:ind w:left="5760" w:hanging="360"/>
+      </w:pPr>
+      <w:rPr>
+        <w:rFonts w:ascii="Wingdings" w:hAnsi="Wingdings" w:hint="default"/>
+        <w:sz w:val="20"/>
+      </w:rPr>
+    </w:lvl>
+    <w:lvl w:ilvl="8" w:tentative="1">
+      <w:start w:val="1"/>
+      <w:numFmt w:val="bullet"/>
+      <w:lvlText w:val=""/>
+      <w:lvlJc w:val="left"/>
+      <w:pPr>
+        <w:tabs>
+          <w:tab w:val="num" w:pos="6480"/>
+        </w:tabs>
+        <w:ind w:left="6480" w:hanging="360"/>
+      </w:pPr>
+      <w:rPr>
+        <w:rFonts w:ascii="Wingdings" w:hAnsi="Wingdings" w:hint="default"/>
+        <w:sz w:val="20"/>
+      </w:rPr>
+    </w:lvl>
+  </w:abstractNum>
+  <w:abstractNum w:abstractNumId="4" w15:restartNumberingAfterBreak="0">
     <w:nsid w:val="1C411E6B"/>
     <w:multiLevelType w:val="multilevel"/>
     <w:tmpl w:val="510C9F52"/>
@@ -4076,7 +6405,7 @@
       </w:rPr>
     </w:lvl>
   </w:abstractNum>
-  <w:abstractNum w:abstractNumId="3" w15:restartNumberingAfterBreak="0">
+  <w:abstractNum w:abstractNumId="5" w15:restartNumberingAfterBreak="0">
     <w:nsid w:val="1E7C3557"/>
     <w:multiLevelType w:val="multilevel"/>
     <w:tmpl w:val="F482E90A"/>
@@ -4225,7 +6554,7 @@
       </w:rPr>
     </w:lvl>
   </w:abstractNum>
-  <w:abstractNum w:abstractNumId="4" w15:restartNumberingAfterBreak="0">
+  <w:abstractNum w:abstractNumId="6" w15:restartNumberingAfterBreak="0">
     <w:nsid w:val="1EDD475C"/>
     <w:multiLevelType w:val="multilevel"/>
     <w:tmpl w:val="9168E68E"/>
@@ -4374,7 +6703,7 @@
       </w:rPr>
     </w:lvl>
   </w:abstractNum>
-  <w:abstractNum w:abstractNumId="5" w15:restartNumberingAfterBreak="0">
+  <w:abstractNum w:abstractNumId="7" w15:restartNumberingAfterBreak="0">
     <w:nsid w:val="24A745E0"/>
     <w:multiLevelType w:val="multilevel"/>
     <w:tmpl w:val="B0DEB22C"/>
@@ -4523,7 +6852,7 @@
       </w:rPr>
     </w:lvl>
   </w:abstractNum>
-  <w:abstractNum w:abstractNumId="6" w15:restartNumberingAfterBreak="0">
+  <w:abstractNum w:abstractNumId="8" w15:restartNumberingAfterBreak="0">
     <w:nsid w:val="42637FD0"/>
     <w:multiLevelType w:val="multilevel"/>
     <w:tmpl w:val="2E34EFEC"/>
@@ -4672,7 +7001,156 @@
       </w:rPr>
     </w:lvl>
   </w:abstractNum>
-  <w:abstractNum w:abstractNumId="7" w15:restartNumberingAfterBreak="0">
+  <w:abstractNum w:abstractNumId="9" w15:restartNumberingAfterBreak="0">
+    <w:nsid w:val="49214C07"/>
+    <w:multiLevelType w:val="multilevel"/>
+    <w:tmpl w:val="CCE031B4"/>
+    <w:lvl w:ilvl="0">
+      <w:start w:val="1"/>
+      <w:numFmt w:val="bullet"/>
+      <w:lvlText w:val=""/>
+      <w:lvlJc w:val="left"/>
+      <w:pPr>
+        <w:tabs>
+          <w:tab w:val="num" w:pos="720"/>
+        </w:tabs>
+        <w:ind w:left="720" w:hanging="360"/>
+      </w:pPr>
+      <w:rPr>
+        <w:rFonts w:ascii="Symbol" w:hAnsi="Symbol" w:hint="default"/>
+        <w:sz w:val="20"/>
+      </w:rPr>
+    </w:lvl>
+    <w:lvl w:ilvl="1" w:tentative="1">
+      <w:start w:val="1"/>
+      <w:numFmt w:val="bullet"/>
+      <w:lvlText w:val="o"/>
+      <w:lvlJc w:val="left"/>
+      <w:pPr>
+        <w:tabs>
+          <w:tab w:val="num" w:pos="1440"/>
+        </w:tabs>
+        <w:ind w:left="1440" w:hanging="360"/>
+      </w:pPr>
+      <w:rPr>
+        <w:rFonts w:ascii="Courier New" w:hAnsi="Courier New" w:hint="default"/>
+        <w:sz w:val="20"/>
+      </w:rPr>
+    </w:lvl>
+    <w:lvl w:ilvl="2" w:tentative="1">
+      <w:start w:val="1"/>
+      <w:numFmt w:val="bullet"/>
+      <w:lvlText w:val=""/>
+      <w:lvlJc w:val="left"/>
+      <w:pPr>
+        <w:tabs>
+          <w:tab w:val="num" w:pos="2160"/>
+        </w:tabs>
+        <w:ind w:left="2160" w:hanging="360"/>
+      </w:pPr>
+      <w:rPr>
+        <w:rFonts w:ascii="Wingdings" w:hAnsi="Wingdings" w:hint="default"/>
+        <w:sz w:val="20"/>
+      </w:rPr>
+    </w:lvl>
+    <w:lvl w:ilvl="3" w:tentative="1">
+      <w:start w:val="1"/>
+      <w:numFmt w:val="bullet"/>
+      <w:lvlText w:val=""/>
+      <w:lvlJc w:val="left"/>
+      <w:pPr>
+        <w:tabs>
+          <w:tab w:val="num" w:pos="2880"/>
+        </w:tabs>
+        <w:ind w:left="2880" w:hanging="360"/>
+      </w:pPr>
+      <w:rPr>
+        <w:rFonts w:ascii="Wingdings" w:hAnsi="Wingdings" w:hint="default"/>
+        <w:sz w:val="20"/>
+      </w:rPr>
+    </w:lvl>
+    <w:lvl w:ilvl="4" w:tentative="1">
+      <w:start w:val="1"/>
+      <w:numFmt w:val="bullet"/>
+      <w:lvlText w:val=""/>
+      <w:lvlJc w:val="left"/>
+      <w:pPr>
+        <w:tabs>
+          <w:tab w:val="num" w:pos="3600"/>
+        </w:tabs>
+        <w:ind w:left="3600" w:hanging="360"/>
+      </w:pPr>
+      <w:rPr>
+        <w:rFonts w:ascii="Wingdings" w:hAnsi="Wingdings" w:hint="default"/>
+        <w:sz w:val="20"/>
+      </w:rPr>
+    </w:lvl>
+    <w:lvl w:ilvl="5" w:tentative="1">
+      <w:start w:val="1"/>
+      <w:numFmt w:val="bullet"/>
+      <w:lvlText w:val=""/>
+      <w:lvlJc w:val="left"/>
+      <w:pPr>
+        <w:tabs>
+          <w:tab w:val="num" w:pos="4320"/>
+        </w:tabs>
+        <w:ind w:left="4320" w:hanging="360"/>
+      </w:pPr>
+      <w:rPr>
+        <w:rFonts w:ascii="Wingdings" w:hAnsi="Wingdings" w:hint="default"/>
+        <w:sz w:val="20"/>
+      </w:rPr>
+    </w:lvl>
+    <w:lvl w:ilvl="6" w:tentative="1">
+      <w:start w:val="1"/>
+      <w:numFmt w:val="bullet"/>
+      <w:lvlText w:val=""/>
+      <w:lvlJc w:val="left"/>
+      <w:pPr>
+        <w:tabs>
+          <w:tab w:val="num" w:pos="5040"/>
+        </w:tabs>
+        <w:ind w:left="5040" w:hanging="360"/>
+      </w:pPr>
+      <w:rPr>
+        <w:rFonts w:ascii="Wingdings" w:hAnsi="Wingdings" w:hint="default"/>
+        <w:sz w:val="20"/>
+      </w:rPr>
+    </w:lvl>
+    <w:lvl w:ilvl="7" w:tentative="1">
+      <w:start w:val="1"/>
+      <w:numFmt w:val="bullet"/>
+      <w:lvlText w:val=""/>
+      <w:lvlJc w:val="left"/>
+      <w:pPr>
+        <w:tabs>
+          <w:tab w:val="num" w:pos="5760"/>
+        </w:tabs>
+        <w:ind w:left="5760" w:hanging="360"/>
+      </w:pPr>
+      <w:rPr>
+        <w:rFonts w:ascii="Wingdings" w:hAnsi="Wingdings" w:hint="default"/>
+        <w:sz w:val="20"/>
+      </w:rPr>
+    </w:lvl>
+    <w:lvl w:ilvl="8" w:tentative="1">
+      <w:start w:val="1"/>
+      <w:numFmt w:val="bullet"/>
+      <w:lvlText w:val=""/>
+      <w:lvlJc w:val="left"/>
+      <w:pPr>
+        <w:tabs>
+          <w:tab w:val="num" w:pos="6480"/>
+        </w:tabs>
+        <w:ind w:left="6480" w:hanging="360"/>
+      </w:pPr>
+      <w:rPr>
+        <w:rFonts w:ascii="Wingdings" w:hAnsi="Wingdings" w:hint="default"/>
+        <w:sz w:val="20"/>
+      </w:rPr>
+    </w:lvl>
+  </w:abstractNum>
+  <w:abstractNum w:abstractNumId="10" w15:restartNumberingAfterBreak="0">
     <w:nsid w:val="53EE22BE"/>
     <w:multiLevelType w:val="multilevel"/>
     <w:tmpl w:val="15C488AC"/>
@@ -4821,7 +7299,156 @@
       </w:rPr>
     </w:lvl>
   </w:abstractNum>
-  <w:abstractNum w:abstractNumId="8" w15:restartNumberingAfterBreak="0">
+  <w:abstractNum w:abstractNumId="11" w15:restartNumberingAfterBreak="0">
+    <w:nsid w:val="5B2B4620"/>
+    <w:multiLevelType w:val="multilevel"/>
+    <w:tmpl w:val="DEAE4926"/>
+    <w:lvl w:ilvl="0">
+      <w:start w:val="1"/>
+      <w:numFmt w:val="bullet"/>
+      <w:lvlText w:val=""/>
+      <w:lvlJc w:val="left"/>
+      <w:pPr>
+        <w:tabs>
+          <w:tab w:val="num" w:pos="720"/>
+        </w:tabs>
+        <w:ind w:left="720" w:hanging="360"/>
+      </w:pPr>
+      <w:rPr>
+        <w:rFonts w:ascii="Symbol" w:hAnsi="Symbol" w:hint="default"/>
+        <w:sz w:val="20"/>
+      </w:rPr>
+    </w:lvl>
+    <w:lvl w:ilvl="1" w:tentative="1">
+      <w:start w:val="1"/>
+      <w:numFmt w:val="bullet"/>
+      <w:lvlText w:val="o"/>
+      <w:lvlJc w:val="left"/>
+      <w:pPr>
+        <w:tabs>
+          <w:tab w:val="num" w:pos="1440"/>
+        </w:tabs>
+        <w:ind w:left="1440" w:hanging="360"/>
+      </w:pPr>
+      <w:rPr>
+        <w:rFonts w:ascii="Courier New" w:hAnsi="Courier New" w:hint="default"/>
+        <w:sz w:val="20"/>
+      </w:rPr>
+    </w:lvl>
+    <w:lvl w:ilvl="2" w:tentative="1">
+      <w:start w:val="1"/>
+      <w:numFmt w:val="bullet"/>
+      <w:lvlText w:val=""/>
+      <w:lvlJc w:val="left"/>
+      <w:pPr>
+        <w:tabs>
+          <w:tab w:val="num" w:pos="2160"/>
+        </w:tabs>
+        <w:ind w:left="2160" w:hanging="360"/>
+      </w:pPr>
+      <w:rPr>
+        <w:rFonts w:ascii="Wingdings" w:hAnsi="Wingdings" w:hint="default"/>
+        <w:sz w:val="20"/>
+      </w:rPr>
+    </w:lvl>
+    <w:lvl w:ilvl="3" w:tentative="1">
+      <w:start w:val="1"/>
+      <w:numFmt w:val="bullet"/>
+      <w:lvlText w:val=""/>
+      <w:lvlJc w:val="left"/>
+      <w:pPr>
+        <w:tabs>
+          <w:tab w:val="num" w:pos="2880"/>
+        </w:tabs>
+        <w:ind w:left="2880" w:hanging="360"/>
+      </w:pPr>
+      <w:rPr>
+        <w:rFonts w:ascii="Wingdings" w:hAnsi="Wingdings" w:hint="default"/>
+        <w:sz w:val="20"/>
+      </w:rPr>
+    </w:lvl>
+    <w:lvl w:ilvl="4" w:tentative="1">
+      <w:start w:val="1"/>
+      <w:numFmt w:val="bullet"/>
+      <w:lvlText w:val=""/>
+      <w:lvlJc w:val="left"/>
+      <w:pPr>
+        <w:tabs>
+          <w:tab w:val="num" w:pos="3600"/>
+        </w:tabs>
+        <w:ind w:left="3600" w:hanging="360"/>
+      </w:pPr>
+      <w:rPr>
+        <w:rFonts w:ascii="Wingdings" w:hAnsi="Wingdings" w:hint="default"/>
+        <w:sz w:val="20"/>
+      </w:rPr>
+    </w:lvl>
+    <w:lvl w:ilvl="5" w:tentative="1">
+      <w:start w:val="1"/>
+      <w:numFmt w:val="bullet"/>
+      <w:lvlText w:val=""/>
+      <w:lvlJc w:val="left"/>
+      <w:pPr>
+        <w:tabs>
+          <w:tab w:val="num" w:pos="4320"/>
+        </w:tabs>
+        <w:ind w:left="4320" w:hanging="360"/>
+      </w:pPr>
+      <w:rPr>
+        <w:rFonts w:ascii="Wingdings" w:hAnsi="Wingdings" w:hint="default"/>
+        <w:sz w:val="20"/>
+      </w:rPr>
+    </w:lvl>
+    <w:lvl w:ilvl="6" w:tentative="1">
+      <w:start w:val="1"/>
+      <w:numFmt w:val="bullet"/>
+      <w:lvlText w:val=""/>
+      <w:lvlJc w:val="left"/>
+      <w:pPr>
+        <w:tabs>
+          <w:tab w:val="num" w:pos="5040"/>
+        </w:tabs>
+        <w:ind w:left="5040" w:hanging="360"/>
+      </w:pPr>
+      <w:rPr>
+        <w:rFonts w:ascii="Wingdings" w:hAnsi="Wingdings" w:hint="default"/>
+        <w:sz w:val="20"/>
+      </w:rPr>
+    </w:lvl>
+    <w:lvl w:ilvl="7" w:tentative="1">
+      <w:start w:val="1"/>
+      <w:numFmt w:val="bullet"/>
+      <w:lvlText w:val=""/>
+      <w:lvlJc w:val="left"/>
+      <w:pPr>
+        <w:tabs>
+          <w:tab w:val="num" w:pos="5760"/>
+        </w:tabs>
+        <w:ind w:left="5760" w:hanging="360"/>
+      </w:pPr>
+      <w:rPr>
+        <w:rFonts w:ascii="Wingdings" w:hAnsi="Wingdings" w:hint="default"/>
+        <w:sz w:val="20"/>
+      </w:rPr>
+    </w:lvl>
+    <w:lvl w:ilvl="8" w:tentative="1">
+      <w:start w:val="1"/>
+      <w:numFmt w:val="bullet"/>
+      <w:lvlText w:val=""/>
+      <w:lvlJc w:val="left"/>
+      <w:pPr>
+        <w:tabs>
+          <w:tab w:val="num" w:pos="6480"/>
+        </w:tabs>
+        <w:ind w:left="6480" w:hanging="360"/>
+      </w:pPr>
+      <w:rPr>
+        <w:rFonts w:ascii="Wingdings" w:hAnsi="Wingdings" w:hint="default"/>
+        <w:sz w:val="20"/>
+      </w:rPr>
+    </w:lvl>
+  </w:abstractNum>
+  <w:abstractNum w:abstractNumId="12" w15:restartNumberingAfterBreak="0">
     <w:nsid w:val="5E245D03"/>
     <w:multiLevelType w:val="multilevel"/>
     <w:tmpl w:val="E7F06B44"/>
@@ -4970,7 +7597,7 @@
       </w:rPr>
     </w:lvl>
   </w:abstractNum>
-  <w:abstractNum w:abstractNumId="9" w15:restartNumberingAfterBreak="0">
+  <w:abstractNum w:abstractNumId="13" w15:restartNumberingAfterBreak="0">
     <w:nsid w:val="60765847"/>
     <w:multiLevelType w:val="multilevel"/>
     <w:tmpl w:val="CD1892F0"/>
@@ -5119,7 +7746,7 @@
       </w:rPr>
     </w:lvl>
   </w:abstractNum>
-  <w:abstractNum w:abstractNumId="10" w15:restartNumberingAfterBreak="0">
+  <w:abstractNum w:abstractNumId="14" w15:restartNumberingAfterBreak="0">
     <w:nsid w:val="627858A3"/>
     <w:multiLevelType w:val="multilevel"/>
     <w:tmpl w:val="52DC3326"/>
@@ -5268,7 +7895,7 @@
       </w:rPr>
     </w:lvl>
   </w:abstractNum>
-  <w:abstractNum w:abstractNumId="11" w15:restartNumberingAfterBreak="0">
+  <w:abstractNum w:abstractNumId="15" w15:restartNumberingAfterBreak="0">
     <w:nsid w:val="6C4603C8"/>
     <w:multiLevelType w:val="multilevel"/>
     <w:tmpl w:val="944A4A44"/>
@@ -5418,40 +8045,52 @@
     </w:lvl>
   </w:abstractNum>
   <w:num w:numId="1" w16cid:durableId="784689604">
+    <w:abstractNumId w:val="6"/>
+  </w:num>
+  <w:num w:numId="2" w16cid:durableId="1435442706">
+    <w:abstractNumId w:val="10"/>
+  </w:num>
+  <w:num w:numId="3" w16cid:durableId="923951586">
+    <w:abstractNumId w:val="12"/>
+  </w:num>
+  <w:num w:numId="4" w16cid:durableId="1263222089">
+    <w:abstractNumId w:val="15"/>
+  </w:num>
+  <w:num w:numId="5" w16cid:durableId="990331384">
+    <w:abstractNumId w:val="13"/>
+  </w:num>
+  <w:num w:numId="6" w16cid:durableId="1261835425">
     <w:abstractNumId w:val="4"/>
   </w:num>
-  <w:num w:numId="2" w16cid:durableId="1435442706">
+  <w:num w:numId="7" w16cid:durableId="582497358">
+    <w:abstractNumId w:val="1"/>
+  </w:num>
+  <w:num w:numId="8" w16cid:durableId="1903176209">
+    <w:abstractNumId w:val="8"/>
+  </w:num>
+  <w:num w:numId="9" w16cid:durableId="459689482">
+    <w:abstractNumId w:val="2"/>
+  </w:num>
+  <w:num w:numId="10" w16cid:durableId="1721051422">
+    <w:abstractNumId w:val="5"/>
+  </w:num>
+  <w:num w:numId="11" w16cid:durableId="1875803199">
     <w:abstractNumId w:val="7"/>
   </w:num>
-  <w:num w:numId="3" w16cid:durableId="923951586">
-    <w:abstractNumId w:val="8"/>
+  <w:num w:numId="12" w16cid:durableId="1650548442">
+    <w:abstractNumId w:val="14"/>
   </w:num>
-  <w:num w:numId="4" w16cid:durableId="1263222089">
+  <w:num w:numId="13" w16cid:durableId="276180516">
+    <w:abstractNumId w:val="9"/>
+  </w:num>
+  <w:num w:numId="14" w16cid:durableId="1523517256">
     <w:abstractNumId w:val="11"/>
   </w:num>
-  <w:num w:numId="5" w16cid:durableId="990331384">
-    <w:abstractNumId w:val="9"/>
-  </w:num>
-  <w:num w:numId="6" w16cid:durableId="1261835425">
-    <w:abstractNumId w:val="2"/>
-  </w:num>
-  <w:num w:numId="7" w16cid:durableId="582497358">
-    <w:abstractNumId w:val="0"/>
-  </w:num>
-  <w:num w:numId="8" w16cid:durableId="1903176209">
-    <w:abstractNumId w:val="6"/>
-  </w:num>
-  <w:num w:numId="9" w16cid:durableId="459689482">
-    <w:abstractNumId w:val="1"/>
-  </w:num>
-  <w:num w:numId="10" w16cid:durableId="1721051422">
+  <w:num w:numId="15" w16cid:durableId="1327594770">
     <w:abstractNumId w:val="3"/>
   </w:num>
-  <w:num w:numId="11" w16cid:durableId="1875803199">
-    <w:abstractNumId w:val="5"/>
-  </w:num>
-  <w:num w:numId="12" w16cid:durableId="1650548442">
-    <w:abstractNumId w:val="10"/>
+  <w:num w:numId="16" w16cid:durableId="1715108565">
+    <w:abstractNumId w:val="0"/>
   </w:num>
 </w:numbering>
 </file>

</xml_diff>